<commit_message>
feat: implement LibreOffice-based docx-to-odt conversion utility with macro-driven formatting support
</commit_message>
<xml_diff>
--- a/draft-pleading/assets/pleading-tmpl.docx
+++ b/draft-pleading/assets/pleading-tmpl.docx
@@ -4,7 +4,7 @@
   <w:body>
     <w:p>
       <w:pPr>
-        <w:pStyle w:val="ae"/>
+        <w:pStyle w:val="ad"/>
         <w:numPr>
           <w:ilvl w:val="1"/>
           <w:numId w:val="3"/>
@@ -16,7 +16,7 @@
     </w:p>
     <w:p>
       <w:pPr>
-        <w:pStyle w:val="ad"/>
+        <w:pStyle w:val="ac"/>
         <w:rPr>
           <w:rFonts w:cs="細明體"/>
           <w:color w:val="000000"/>
@@ -52,7 +52,7 @@
     </w:p>
     <w:p>
       <w:pPr>
-        <w:pStyle w:val="ad"/>
+        <w:pStyle w:val="ac"/>
       </w:pPr>
       <w:proofErr w:type="gramStart"/>
       <w:r>
@@ -65,7 +65,7 @@
     </w:p>
     <w:p>
       <w:pPr>
-        <w:pStyle w:val="af6"/>
+        <w:pStyle w:val="af5"/>
       </w:pPr>
       <w:r>
         <w:t>被告</w:t>
@@ -88,7 +88,7 @@
     </w:p>
     <w:p>
       <w:pPr>
-        <w:pStyle w:val="af6"/>
+        <w:pStyle w:val="af5"/>
       </w:pPr>
       <w:r>
         <w:t>法定代理人</w:t>
@@ -100,7 +100,7 @@
     </w:p>
     <w:p>
       <w:pPr>
-        <w:pStyle w:val="af6"/>
+        <w:pStyle w:val="af5"/>
       </w:pPr>
       <w:r>
         <w:t>訴訟代理人</w:t>
@@ -129,7 +129,7 @@
     </w:p>
     <w:p>
       <w:pPr>
-        <w:pStyle w:val="af6"/>
+        <w:pStyle w:val="af5"/>
       </w:pPr>
       <w:r>
         <w:t>原告</w:t>
@@ -141,7 +141,7 @@
     </w:p>
     <w:p>
       <w:pPr>
-        <w:pStyle w:val="af6"/>
+        <w:pStyle w:val="af5"/>
       </w:pPr>
       <w:r>
         <w:t>訴訟代理人</w:t>
@@ -153,7 +153,7 @@
     </w:p>
     <w:p>
       <w:pPr>
-        <w:pStyle w:val="ad"/>
+        <w:pStyle w:val="ac"/>
       </w:pPr>
       <w:r>
         <w:rPr>
@@ -189,12 +189,12 @@
     </w:p>
     <w:p>
       <w:pPr>
-        <w:pStyle w:val="ad"/>
+        <w:pStyle w:val="ac"/>
       </w:pPr>
     </w:p>
     <w:p>
       <w:pPr>
-        <w:pStyle w:val="ad"/>
+        <w:pStyle w:val="ac"/>
       </w:pPr>
       <w:r>
         <w:t>證據或文件清單：</w:t>
@@ -202,7 +202,7 @@
     </w:p>
     <w:p>
       <w:pPr>
-        <w:pStyle w:val="af0"/>
+        <w:pStyle w:val="af"/>
       </w:pPr>
       <w:proofErr w:type="gramStart"/>
       <w:r>
@@ -228,7 +228,7 @@
     </w:p>
     <w:p>
       <w:pPr>
-        <w:pStyle w:val="af1"/>
+        <w:pStyle w:val="af0"/>
       </w:pPr>
       <w:r>
         <w:t>謹狀</w:t>
@@ -236,7 +236,7 @@
     </w:p>
     <w:p>
       <w:pPr>
-        <w:pStyle w:val="ad"/>
+        <w:pStyle w:val="ac"/>
         <w:rPr>
           <w:rFonts w:cs="細明體"/>
           <w:color w:val="000000"/>
@@ -276,7 +276,7 @@
     </w:p>
     <w:p>
       <w:pPr>
-        <w:pStyle w:val="af9"/>
+        <w:pStyle w:val="af7"/>
       </w:pPr>
       <w:r>
         <w:t>中華民國115年4月27日</w:t>
@@ -284,7 +284,7 @@
     </w:p>
     <w:p>
       <w:pPr>
-        <w:pStyle w:val="af"/>
+        <w:pStyle w:val="ae"/>
       </w:pPr>
       <w:proofErr w:type="gramStart"/>
       <w:r>
@@ -305,7 +305,7 @@
     </w:p>
     <w:p>
       <w:pPr>
-        <w:pStyle w:val="af"/>
+        <w:pStyle w:val="ae"/>
       </w:pPr>
       <w:r>
         <w:t>訴訟代理人：王小華律師</w:t>
@@ -313,7 +313,7 @@
     </w:p>
     <w:p>
       <w:pPr>
-        <w:pStyle w:val="ad"/>
+        <w:pStyle w:val="ac"/>
       </w:pPr>
       <w:r>
         <w:br w:type="page"/>
@@ -321,7 +321,7 @@
     </w:p>
     <w:p>
       <w:pPr>
-        <w:pStyle w:val="ad"/>
+        <w:pStyle w:val="ac"/>
       </w:pPr>
     </w:p>
     <w:tbl>
@@ -338,10 +338,10 @@
         <w:tblLook w:val="04A0" w:firstRow="1" w:lastRow="0" w:firstColumn="1" w:lastColumn="0" w:noHBand="0" w:noVBand="1"/>
       </w:tblPr>
       <w:tblGrid>
-        <w:gridCol w:w="1759"/>
-        <w:gridCol w:w="2438"/>
-        <w:gridCol w:w="2435"/>
+        <w:gridCol w:w="1758"/>
         <w:gridCol w:w="2439"/>
+        <w:gridCol w:w="2434"/>
+        <w:gridCol w:w="2440"/>
       </w:tblGrid>
       <w:tr>
         <w:trPr>
@@ -351,7 +351,7 @@
         </w:trPr>
         <w:tc>
           <w:tcPr>
-            <w:tcW w:w="1759" w:type="dxa"/>
+            <w:tcW w:w="1758" w:type="dxa"/>
             <w:tcBorders>
               <w:top w:val="single" w:sz="4" w:space="0" w:color="000000"/>
               <w:left w:val="single" w:sz="4" w:space="0" w:color="000000"/>
@@ -361,7 +361,7 @@
           </w:tcPr>
           <w:p>
             <w:pPr>
-              <w:pStyle w:val="afc"/>
+              <w:pStyle w:val="afb"/>
             </w:pPr>
             <w:r>
               <w:t>爭點</w:t>
@@ -370,7 +370,7 @@
         </w:tc>
         <w:tc>
           <w:tcPr>
-            <w:tcW w:w="2438" w:type="dxa"/>
+            <w:tcW w:w="2439" w:type="dxa"/>
             <w:tcBorders>
               <w:top w:val="single" w:sz="4" w:space="0" w:color="000000"/>
               <w:left w:val="single" w:sz="4" w:space="0" w:color="000000"/>
@@ -380,7 +380,7 @@
           </w:tcPr>
           <w:p>
             <w:pPr>
-              <w:pStyle w:val="afc"/>
+              <w:pStyle w:val="afb"/>
             </w:pPr>
             <w:r>
               <w:t>原因事實</w:t>
@@ -389,7 +389,7 @@
         </w:tc>
         <w:tc>
           <w:tcPr>
-            <w:tcW w:w="2435" w:type="dxa"/>
+            <w:tcW w:w="2434" w:type="dxa"/>
             <w:tcBorders>
               <w:top w:val="single" w:sz="4" w:space="0" w:color="000000"/>
               <w:left w:val="single" w:sz="4" w:space="0" w:color="000000"/>
@@ -399,7 +399,7 @@
           </w:tcPr>
           <w:p>
             <w:pPr>
-              <w:pStyle w:val="afc"/>
+              <w:pStyle w:val="afb"/>
             </w:pPr>
             <w:r>
               <w:t>法律依據</w:t>
@@ -408,7 +408,7 @@
         </w:tc>
         <w:tc>
           <w:tcPr>
-            <w:tcW w:w="2439" w:type="dxa"/>
+            <w:tcW w:w="2440" w:type="dxa"/>
             <w:tcBorders>
               <w:top w:val="single" w:sz="4" w:space="0" w:color="000000"/>
               <w:left w:val="single" w:sz="4" w:space="0" w:color="000000"/>
@@ -419,7 +419,7 @@
           </w:tcPr>
           <w:p>
             <w:pPr>
-              <w:pStyle w:val="afc"/>
+              <w:pStyle w:val="afb"/>
             </w:pPr>
             <w:r>
               <w:t>證據</w:t>
@@ -434,7 +434,21 @@
         </w:trPr>
         <w:tc>
           <w:tcPr>
-            <w:tcW w:w="1759" w:type="dxa"/>
+            <w:tcW w:w="1758" w:type="dxa"/>
+            <w:tcBorders>
+              <w:left w:val="single" w:sz="4" w:space="0" w:color="000000"/>
+              <w:bottom w:val="single" w:sz="4" w:space="0" w:color="000000"/>
+            </w:tcBorders>
+          </w:tcPr>
+          <w:p>
+            <w:pPr>
+              <w:pStyle w:val="af9"/>
+            </w:pPr>
+          </w:p>
+        </w:tc>
+        <w:tc>
+          <w:tcPr>
+            <w:tcW w:w="2439" w:type="dxa"/>
             <w:tcBorders>
               <w:left w:val="single" w:sz="4" w:space="0" w:color="000000"/>
               <w:bottom w:val="single" w:sz="4" w:space="0" w:color="000000"/>
@@ -443,20 +457,6 @@
           <w:p>
             <w:pPr>
               <w:pStyle w:val="afa"/>
-            </w:pPr>
-          </w:p>
-        </w:tc>
-        <w:tc>
-          <w:tcPr>
-            <w:tcW w:w="2438" w:type="dxa"/>
-            <w:tcBorders>
-              <w:left w:val="single" w:sz="4" w:space="0" w:color="000000"/>
-              <w:bottom w:val="single" w:sz="4" w:space="0" w:color="000000"/>
-            </w:tcBorders>
-          </w:tcPr>
-          <w:p>
-            <w:pPr>
-              <w:pStyle w:val="afb"/>
             </w:pPr>
             <w:r>
               <w:t>•</w:t>
@@ -465,30 +465,30 @@
         </w:tc>
         <w:tc>
           <w:tcPr>
-            <w:tcW w:w="2435" w:type="dxa"/>
-            <w:tcBorders>
-              <w:left w:val="single" w:sz="4" w:space="0" w:color="000000"/>
-              <w:bottom w:val="single" w:sz="4" w:space="0" w:color="000000"/>
+            <w:tcW w:w="2434" w:type="dxa"/>
+            <w:tcBorders>
+              <w:left w:val="single" w:sz="4" w:space="0" w:color="000000"/>
+              <w:bottom w:val="single" w:sz="4" w:space="0" w:color="000000"/>
+            </w:tcBorders>
+          </w:tcPr>
+          <w:p>
+            <w:pPr>
+              <w:pStyle w:val="af9"/>
+            </w:pPr>
+          </w:p>
+        </w:tc>
+        <w:tc>
+          <w:tcPr>
+            <w:tcW w:w="2440" w:type="dxa"/>
+            <w:tcBorders>
+              <w:left w:val="single" w:sz="4" w:space="0" w:color="000000"/>
+              <w:bottom w:val="single" w:sz="4" w:space="0" w:color="000000"/>
+              <w:right w:val="single" w:sz="4" w:space="0" w:color="000000"/>
             </w:tcBorders>
           </w:tcPr>
           <w:p>
             <w:pPr>
               <w:pStyle w:val="afa"/>
-            </w:pPr>
-          </w:p>
-        </w:tc>
-        <w:tc>
-          <w:tcPr>
-            <w:tcW w:w="2439" w:type="dxa"/>
-            <w:tcBorders>
-              <w:left w:val="single" w:sz="4" w:space="0" w:color="000000"/>
-              <w:bottom w:val="single" w:sz="4" w:space="0" w:color="000000"/>
-              <w:right w:val="single" w:sz="4" w:space="0" w:color="000000"/>
-            </w:tcBorders>
-          </w:tcPr>
-          <w:p>
-            <w:pPr>
-              <w:pStyle w:val="afb"/>
             </w:pPr>
           </w:p>
         </w:tc>
@@ -496,7 +496,7 @@
     </w:tbl>
     <w:p>
       <w:pPr>
-        <w:pStyle w:val="ad"/>
+        <w:pStyle w:val="ac"/>
       </w:pPr>
     </w:p>
     <w:p>
@@ -521,9 +521,9 @@
         <w:tblLook w:val="04A0" w:firstRow="1" w:lastRow="0" w:firstColumn="1" w:lastColumn="0" w:noHBand="0" w:noVBand="1"/>
       </w:tblPr>
       <w:tblGrid>
-        <w:gridCol w:w="510"/>
+        <w:gridCol w:w="509"/>
         <w:gridCol w:w="1701"/>
-        <w:gridCol w:w="1701"/>
+        <w:gridCol w:w="1702"/>
         <w:gridCol w:w="1700"/>
         <w:gridCol w:w="1758"/>
         <w:gridCol w:w="1701"/>
@@ -535,7 +535,7 @@
         </w:trPr>
         <w:tc>
           <w:tcPr>
-            <w:tcW w:w="510" w:type="dxa"/>
+            <w:tcW w:w="509" w:type="dxa"/>
             <w:tcBorders>
               <w:top w:val="single" w:sz="4" w:space="0" w:color="000000"/>
               <w:left w:val="single" w:sz="4" w:space="0" w:color="000000"/>
@@ -545,7 +545,7 @@
           </w:tcPr>
           <w:p>
             <w:pPr>
-              <w:pStyle w:val="afc"/>
+              <w:pStyle w:val="afb"/>
             </w:pPr>
             <w:r>
               <w:t>編號</w:t>
@@ -564,7 +564,7 @@
           </w:tcPr>
           <w:p>
             <w:pPr>
-              <w:pStyle w:val="afc"/>
+              <w:pStyle w:val="afb"/>
             </w:pPr>
             <w:proofErr w:type="gramStart"/>
             <w:r>
@@ -575,7 +575,7 @@
         </w:tc>
         <w:tc>
           <w:tcPr>
-            <w:tcW w:w="1701" w:type="dxa"/>
+            <w:tcW w:w="1702" w:type="dxa"/>
             <w:tcBorders>
               <w:top w:val="single" w:sz="4" w:space="0" w:color="000000"/>
               <w:left w:val="single" w:sz="4" w:space="0" w:color="000000"/>
@@ -585,7 +585,7 @@
           </w:tcPr>
           <w:p>
             <w:pPr>
-              <w:pStyle w:val="afc"/>
+              <w:pStyle w:val="afb"/>
             </w:pPr>
             <w:r>
               <w:t>調查事項</w:t>
@@ -604,7 +604,7 @@
           </w:tcPr>
           <w:p>
             <w:pPr>
-              <w:pStyle w:val="afc"/>
+              <w:pStyle w:val="afb"/>
             </w:pPr>
             <w:r>
               <w:t>調查對象</w:t>
@@ -623,7 +623,7 @@
           </w:tcPr>
           <w:p>
             <w:pPr>
-              <w:pStyle w:val="afc"/>
+              <w:pStyle w:val="afb"/>
             </w:pPr>
             <w:r>
               <w:t>對象地址</w:t>
@@ -631,7 +631,7 @@
           </w:p>
           <w:p>
             <w:pPr>
-              <w:pStyle w:val="afc"/>
+              <w:pStyle w:val="afb"/>
             </w:pPr>
             <w:r>
               <w:t>及聯絡方式</w:t>
@@ -651,7 +651,7 @@
           </w:tcPr>
           <w:p>
             <w:pPr>
-              <w:pStyle w:val="afc"/>
+              <w:pStyle w:val="afb"/>
             </w:pPr>
             <w:proofErr w:type="gramStart"/>
             <w:r>
@@ -667,7 +667,23 @@
         </w:trPr>
         <w:tc>
           <w:tcPr>
-            <w:tcW w:w="510" w:type="dxa"/>
+            <w:tcW w:w="509" w:type="dxa"/>
+            <w:tcBorders>
+              <w:left w:val="single" w:sz="4" w:space="0" w:color="000000"/>
+              <w:bottom w:val="single" w:sz="4" w:space="0" w:color="000000"/>
+            </w:tcBorders>
+            <w:vAlign w:val="center"/>
+          </w:tcPr>
+          <w:p>
+            <w:pPr>
+              <w:pStyle w:val="af9"/>
+              <w:jc w:val="center"/>
+            </w:pPr>
+          </w:p>
+        </w:tc>
+        <w:tc>
+          <w:tcPr>
+            <w:tcW w:w="1701" w:type="dxa"/>
             <w:tcBorders>
               <w:left w:val="single" w:sz="4" w:space="0" w:color="000000"/>
               <w:bottom w:val="single" w:sz="4" w:space="0" w:color="000000"/>
@@ -677,7 +693,51 @@
           <w:p>
             <w:pPr>
               <w:pStyle w:val="afa"/>
-              <w:jc w:val="center"/>
+            </w:pPr>
+          </w:p>
+        </w:tc>
+        <w:tc>
+          <w:tcPr>
+            <w:tcW w:w="1702" w:type="dxa"/>
+            <w:tcBorders>
+              <w:left w:val="single" w:sz="4" w:space="0" w:color="000000"/>
+              <w:bottom w:val="single" w:sz="4" w:space="0" w:color="000000"/>
+            </w:tcBorders>
+            <w:vAlign w:val="center"/>
+          </w:tcPr>
+          <w:p>
+            <w:pPr>
+              <w:pStyle w:val="afa"/>
+            </w:pPr>
+          </w:p>
+        </w:tc>
+        <w:tc>
+          <w:tcPr>
+            <w:tcW w:w="1700" w:type="dxa"/>
+            <w:tcBorders>
+              <w:left w:val="single" w:sz="4" w:space="0" w:color="000000"/>
+              <w:bottom w:val="single" w:sz="4" w:space="0" w:color="000000"/>
+            </w:tcBorders>
+            <w:vAlign w:val="center"/>
+          </w:tcPr>
+          <w:p>
+            <w:pPr>
+              <w:pStyle w:val="af9"/>
+            </w:pPr>
+          </w:p>
+        </w:tc>
+        <w:tc>
+          <w:tcPr>
+            <w:tcW w:w="1758" w:type="dxa"/>
+            <w:tcBorders>
+              <w:left w:val="single" w:sz="4" w:space="0" w:color="000000"/>
+              <w:bottom w:val="single" w:sz="4" w:space="0" w:color="000000"/>
+            </w:tcBorders>
+            <w:vAlign w:val="center"/>
+          </w:tcPr>
+          <w:p>
+            <w:pPr>
+              <w:pStyle w:val="af9"/>
             </w:pPr>
           </w:p>
         </w:tc>
@@ -687,73 +747,13 @@
             <w:tcBorders>
               <w:left w:val="single" w:sz="4" w:space="0" w:color="000000"/>
               <w:bottom w:val="single" w:sz="4" w:space="0" w:color="000000"/>
-            </w:tcBorders>
-            <w:vAlign w:val="center"/>
-          </w:tcPr>
-          <w:p>
-            <w:pPr>
-              <w:pStyle w:val="afb"/>
-            </w:pPr>
-          </w:p>
-        </w:tc>
-        <w:tc>
-          <w:tcPr>
-            <w:tcW w:w="1701" w:type="dxa"/>
-            <w:tcBorders>
-              <w:left w:val="single" w:sz="4" w:space="0" w:color="000000"/>
-              <w:bottom w:val="single" w:sz="4" w:space="0" w:color="000000"/>
-            </w:tcBorders>
-            <w:vAlign w:val="center"/>
-          </w:tcPr>
-          <w:p>
-            <w:pPr>
-              <w:pStyle w:val="afb"/>
-            </w:pPr>
-          </w:p>
-        </w:tc>
-        <w:tc>
-          <w:tcPr>
-            <w:tcW w:w="1700" w:type="dxa"/>
-            <w:tcBorders>
-              <w:left w:val="single" w:sz="4" w:space="0" w:color="000000"/>
-              <w:bottom w:val="single" w:sz="4" w:space="0" w:color="000000"/>
+              <w:right w:val="single" w:sz="4" w:space="0" w:color="000000"/>
             </w:tcBorders>
             <w:vAlign w:val="center"/>
           </w:tcPr>
           <w:p>
             <w:pPr>
               <w:pStyle w:val="afa"/>
-            </w:pPr>
-          </w:p>
-        </w:tc>
-        <w:tc>
-          <w:tcPr>
-            <w:tcW w:w="1758" w:type="dxa"/>
-            <w:tcBorders>
-              <w:left w:val="single" w:sz="4" w:space="0" w:color="000000"/>
-              <w:bottom w:val="single" w:sz="4" w:space="0" w:color="000000"/>
-            </w:tcBorders>
-            <w:vAlign w:val="center"/>
-          </w:tcPr>
-          <w:p>
-            <w:pPr>
-              <w:pStyle w:val="afa"/>
-            </w:pPr>
-          </w:p>
-        </w:tc>
-        <w:tc>
-          <w:tcPr>
-            <w:tcW w:w="1701" w:type="dxa"/>
-            <w:tcBorders>
-              <w:left w:val="single" w:sz="4" w:space="0" w:color="000000"/>
-              <w:bottom w:val="single" w:sz="4" w:space="0" w:color="000000"/>
-              <w:right w:val="single" w:sz="4" w:space="0" w:color="000000"/>
-            </w:tcBorders>
-            <w:vAlign w:val="center"/>
-          </w:tcPr>
-          <w:p>
-            <w:pPr>
-              <w:pStyle w:val="afb"/>
             </w:pPr>
           </w:p>
         </w:tc>
@@ -761,7 +761,7 @@
     </w:tbl>
     <w:p>
       <w:pPr>
-        <w:pStyle w:val="ad"/>
+        <w:pStyle w:val="ac"/>
       </w:pPr>
     </w:p>
     <w:tbl>
@@ -780,10 +780,10 @@
       <w:tblGrid>
         <w:gridCol w:w="506"/>
         <w:gridCol w:w="1064"/>
+        <w:gridCol w:w="1454"/>
         <w:gridCol w:w="1455"/>
         <w:gridCol w:w="1455"/>
-        <w:gridCol w:w="1455"/>
-        <w:gridCol w:w="995"/>
+        <w:gridCol w:w="996"/>
         <w:gridCol w:w="1524"/>
         <w:gridCol w:w="618"/>
       </w:tblGrid>
@@ -795,7 +795,7 @@
         </w:trPr>
         <w:tc>
           <w:tcPr>
-            <w:tcW w:w="510" w:type="dxa"/>
+            <w:tcW w:w="506" w:type="dxa"/>
             <w:vMerge w:val="restart"/>
             <w:tcBorders>
               <w:top w:val="single" w:sz="4" w:space="0" w:color="000000"/>
@@ -806,7 +806,7 @@
           </w:tcPr>
           <w:p>
             <w:pPr>
-              <w:pStyle w:val="afc"/>
+              <w:pStyle w:val="afb"/>
             </w:pPr>
             <w:r>
               <w:t>序號</w:t>
@@ -815,7 +815,7 @@
         </w:tc>
         <w:tc>
           <w:tcPr>
-            <w:tcW w:w="1077" w:type="dxa"/>
+            <w:tcW w:w="1064" w:type="dxa"/>
             <w:vMerge w:val="restart"/>
             <w:tcBorders>
               <w:top w:val="single" w:sz="4" w:space="0" w:color="000000"/>
@@ -826,7 +826,7 @@
           </w:tcPr>
           <w:p>
             <w:pPr>
-              <w:pStyle w:val="afc"/>
+              <w:pStyle w:val="afb"/>
             </w:pPr>
             <w:r>
               <w:t>證據</w:t>
@@ -839,7 +839,7 @@
         </w:tc>
         <w:tc>
           <w:tcPr>
-            <w:tcW w:w="1474" w:type="dxa"/>
+            <w:tcW w:w="1454" w:type="dxa"/>
             <w:vMerge w:val="restart"/>
             <w:tcBorders>
               <w:top w:val="single" w:sz="4" w:space="0" w:color="000000"/>
@@ -850,7 +850,7 @@
           </w:tcPr>
           <w:p>
             <w:pPr>
-              <w:pStyle w:val="afc"/>
+              <w:pStyle w:val="afb"/>
             </w:pPr>
             <w:r>
               <w:t>證據名稱</w:t>
@@ -859,7 +859,7 @@
         </w:tc>
         <w:tc>
           <w:tcPr>
-            <w:tcW w:w="1474" w:type="dxa"/>
+            <w:tcW w:w="1455" w:type="dxa"/>
             <w:vMerge w:val="restart"/>
             <w:tcBorders>
               <w:top w:val="single" w:sz="4" w:space="0" w:color="000000"/>
@@ -870,7 +870,7 @@
           </w:tcPr>
           <w:p>
             <w:pPr>
-              <w:pStyle w:val="afc"/>
+              <w:pStyle w:val="afb"/>
             </w:pPr>
             <w:r>
               <w:t>證據</w:t>
@@ -883,7 +883,7 @@
         </w:tc>
         <w:tc>
           <w:tcPr>
-            <w:tcW w:w="1474" w:type="dxa"/>
+            <w:tcW w:w="1455" w:type="dxa"/>
             <w:vMerge w:val="restart"/>
             <w:tcBorders>
               <w:top w:val="single" w:sz="4" w:space="0" w:color="000000"/>
@@ -894,7 +894,7 @@
           </w:tcPr>
           <w:p>
             <w:pPr>
-              <w:pStyle w:val="afc"/>
+              <w:pStyle w:val="afb"/>
             </w:pPr>
             <w:proofErr w:type="gramStart"/>
             <w:r>
@@ -905,7 +905,7 @@
         </w:tc>
         <w:tc>
           <w:tcPr>
-            <w:tcW w:w="2551" w:type="dxa"/>
+            <w:tcW w:w="2520" w:type="dxa"/>
             <w:gridSpan w:val="2"/>
             <w:tcBorders>
               <w:top w:val="single" w:sz="4" w:space="0" w:color="000000"/>
@@ -916,7 +916,7 @@
           </w:tcPr>
           <w:p>
             <w:pPr>
-              <w:pStyle w:val="afc"/>
+              <w:pStyle w:val="afb"/>
             </w:pPr>
             <w:r>
               <w:t>證據附卷位置</w:t>
@@ -925,7 +925,7 @@
         </w:tc>
         <w:tc>
           <w:tcPr>
-            <w:tcW w:w="625" w:type="dxa"/>
+            <w:tcW w:w="618" w:type="dxa"/>
             <w:vMerge w:val="restart"/>
             <w:tcBorders>
               <w:top w:val="single" w:sz="4" w:space="0" w:color="000000"/>
@@ -937,7 +937,7 @@
           </w:tcPr>
           <w:p>
             <w:pPr>
-              <w:pStyle w:val="afc"/>
+              <w:pStyle w:val="afb"/>
             </w:pPr>
             <w:r>
               <w:t>備註</w:t>
@@ -958,7 +958,7 @@
         </w:trPr>
         <w:tc>
           <w:tcPr>
-            <w:tcW w:w="510" w:type="dxa"/>
+            <w:tcW w:w="506" w:type="dxa"/>
             <w:vMerge/>
             <w:tcBorders>
               <w:left w:val="single" w:sz="4" w:space="0" w:color="000000"/>
@@ -968,7 +968,7 @@
           </w:tcPr>
           <w:p>
             <w:pPr>
-              <w:pStyle w:val="user1"/>
+              <w:pStyle w:val="af8"/>
               <w:rPr>
                 <w:rFonts w:ascii="標楷體" w:eastAsia="標楷體" w:hAnsi="標楷體"/>
               </w:rPr>
@@ -977,7 +977,7 @@
         </w:tc>
         <w:tc>
           <w:tcPr>
-            <w:tcW w:w="1077" w:type="dxa"/>
+            <w:tcW w:w="1064" w:type="dxa"/>
             <w:vMerge/>
             <w:tcBorders>
               <w:left w:val="single" w:sz="4" w:space="0" w:color="000000"/>
@@ -987,7 +987,7 @@
           </w:tcPr>
           <w:p>
             <w:pPr>
-              <w:pStyle w:val="user1"/>
+              <w:pStyle w:val="af8"/>
               <w:rPr>
                 <w:rFonts w:ascii="標楷體" w:eastAsia="標楷體" w:hAnsi="標楷體"/>
               </w:rPr>
@@ -996,7 +996,7 @@
         </w:tc>
         <w:tc>
           <w:tcPr>
-            <w:tcW w:w="1474" w:type="dxa"/>
+            <w:tcW w:w="1454" w:type="dxa"/>
             <w:vMerge/>
             <w:tcBorders>
               <w:left w:val="single" w:sz="4" w:space="0" w:color="000000"/>
@@ -1006,7 +1006,7 @@
           </w:tcPr>
           <w:p>
             <w:pPr>
-              <w:pStyle w:val="user1"/>
+              <w:pStyle w:val="af8"/>
               <w:rPr>
                 <w:rFonts w:ascii="標楷體" w:eastAsia="標楷體" w:hAnsi="標楷體"/>
               </w:rPr>
@@ -1015,7 +1015,7 @@
         </w:tc>
         <w:tc>
           <w:tcPr>
-            <w:tcW w:w="1474" w:type="dxa"/>
+            <w:tcW w:w="1455" w:type="dxa"/>
             <w:vMerge/>
             <w:tcBorders>
               <w:left w:val="single" w:sz="4" w:space="0" w:color="000000"/>
@@ -1025,7 +1025,7 @@
           </w:tcPr>
           <w:p>
             <w:pPr>
-              <w:pStyle w:val="user1"/>
+              <w:pStyle w:val="af8"/>
               <w:rPr>
                 <w:rFonts w:ascii="標楷體" w:eastAsia="標楷體" w:hAnsi="標楷體"/>
               </w:rPr>
@@ -1034,7 +1034,7 @@
         </w:tc>
         <w:tc>
           <w:tcPr>
-            <w:tcW w:w="1474" w:type="dxa"/>
+            <w:tcW w:w="1455" w:type="dxa"/>
             <w:vMerge/>
             <w:tcBorders>
               <w:left w:val="single" w:sz="4" w:space="0" w:color="000000"/>
@@ -1044,7 +1044,7 @@
           </w:tcPr>
           <w:p>
             <w:pPr>
-              <w:pStyle w:val="user1"/>
+              <w:pStyle w:val="af8"/>
               <w:rPr>
                 <w:rFonts w:ascii="標楷體" w:eastAsia="標楷體" w:hAnsi="標楷體"/>
               </w:rPr>
@@ -1053,16 +1053,16 @@
         </w:tc>
         <w:tc>
           <w:tcPr>
-            <w:tcW w:w="1007" w:type="dxa"/>
-            <w:tcBorders>
-              <w:left w:val="single" w:sz="4" w:space="0" w:color="000000"/>
-              <w:bottom w:val="single" w:sz="4" w:space="0" w:color="000000"/>
-            </w:tcBorders>
-            <w:vAlign w:val="center"/>
-          </w:tcPr>
-          <w:p>
-            <w:pPr>
-              <w:pStyle w:val="afc"/>
+            <w:tcW w:w="996" w:type="dxa"/>
+            <w:tcBorders>
+              <w:left w:val="single" w:sz="4" w:space="0" w:color="000000"/>
+              <w:bottom w:val="single" w:sz="4" w:space="0" w:color="000000"/>
+            </w:tcBorders>
+            <w:vAlign w:val="center"/>
+          </w:tcPr>
+          <w:p>
+            <w:pPr>
+              <w:pStyle w:val="afb"/>
               <w:rPr>
                 <w:sz w:val="22"/>
                 <w:szCs w:val="22"/>
@@ -1079,16 +1079,16 @@
         </w:tc>
         <w:tc>
           <w:tcPr>
-            <w:tcW w:w="1544" w:type="dxa"/>
-            <w:tcBorders>
-              <w:left w:val="single" w:sz="4" w:space="0" w:color="000000"/>
-              <w:bottom w:val="single" w:sz="4" w:space="0" w:color="000000"/>
-            </w:tcBorders>
-            <w:vAlign w:val="center"/>
-          </w:tcPr>
-          <w:p>
-            <w:pPr>
-              <w:pStyle w:val="afc"/>
+            <w:tcW w:w="1524" w:type="dxa"/>
+            <w:tcBorders>
+              <w:left w:val="single" w:sz="4" w:space="0" w:color="000000"/>
+              <w:bottom w:val="single" w:sz="4" w:space="0" w:color="000000"/>
+            </w:tcBorders>
+            <w:vAlign w:val="center"/>
+          </w:tcPr>
+          <w:p>
+            <w:pPr>
+              <w:pStyle w:val="afb"/>
               <w:rPr>
                 <w:sz w:val="22"/>
                 <w:szCs w:val="22"/>
@@ -1105,7 +1105,7 @@
         </w:tc>
         <w:tc>
           <w:tcPr>
-            <w:tcW w:w="625" w:type="dxa"/>
+            <w:tcW w:w="618" w:type="dxa"/>
             <w:vMerge/>
             <w:tcBorders>
               <w:top w:val="single" w:sz="4" w:space="0" w:color="000000"/>
@@ -1117,7 +1117,7 @@
           </w:tcPr>
           <w:p>
             <w:pPr>
-              <w:pStyle w:val="afc"/>
+              <w:pStyle w:val="afb"/>
             </w:pPr>
           </w:p>
         </w:tc>
@@ -1129,35 +1129,35 @@
         </w:trPr>
         <w:tc>
           <w:tcPr>
-            <w:tcW w:w="510" w:type="dxa"/>
-            <w:tcBorders>
-              <w:left w:val="single" w:sz="4" w:space="0" w:color="000000"/>
-              <w:bottom w:val="single" w:sz="4" w:space="0" w:color="000000"/>
-            </w:tcBorders>
-            <w:vAlign w:val="center"/>
-          </w:tcPr>
-          <w:p>
-            <w:pPr>
-              <w:pStyle w:val="user1"/>
+            <w:tcW w:w="506" w:type="dxa"/>
+            <w:tcBorders>
+              <w:left w:val="single" w:sz="4" w:space="0" w:color="000000"/>
+              <w:bottom w:val="single" w:sz="4" w:space="0" w:color="000000"/>
+            </w:tcBorders>
+            <w:vAlign w:val="center"/>
+          </w:tcPr>
+          <w:p>
+            <w:pPr>
+              <w:pStyle w:val="af8"/>
               <w:jc w:val="center"/>
               <w:rPr>
-                <w:rFonts w:ascii="標楷體" w:eastAsia="標楷體" w:hAnsi="標楷體" w:hint="eastAsia"/>
+                <w:rFonts w:ascii="標楷體" w:eastAsia="標楷體" w:hAnsi="標楷體"/>
               </w:rPr>
             </w:pPr>
           </w:p>
         </w:tc>
         <w:tc>
           <w:tcPr>
-            <w:tcW w:w="1077" w:type="dxa"/>
-            <w:tcBorders>
-              <w:left w:val="single" w:sz="4" w:space="0" w:color="000000"/>
-              <w:bottom w:val="single" w:sz="4" w:space="0" w:color="000000"/>
-            </w:tcBorders>
-            <w:vAlign w:val="center"/>
-          </w:tcPr>
-          <w:p>
-            <w:pPr>
-              <w:pStyle w:val="user1"/>
+            <w:tcW w:w="1064" w:type="dxa"/>
+            <w:tcBorders>
+              <w:left w:val="single" w:sz="4" w:space="0" w:color="000000"/>
+              <w:bottom w:val="single" w:sz="4" w:space="0" w:color="000000"/>
+            </w:tcBorders>
+            <w:vAlign w:val="center"/>
+          </w:tcPr>
+          <w:p>
+            <w:pPr>
+              <w:pStyle w:val="af8"/>
               <w:jc w:val="center"/>
               <w:rPr>
                 <w:rFonts w:ascii="標楷體" w:eastAsia="標楷體" w:hAnsi="標楷體"/>
@@ -1197,16 +1197,16 @@
         </w:tc>
         <w:tc>
           <w:tcPr>
-            <w:tcW w:w="1474" w:type="dxa"/>
-            <w:tcBorders>
-              <w:left w:val="single" w:sz="4" w:space="0" w:color="000000"/>
-              <w:bottom w:val="single" w:sz="4" w:space="0" w:color="000000"/>
-            </w:tcBorders>
-            <w:vAlign w:val="center"/>
-          </w:tcPr>
-          <w:p>
-            <w:pPr>
-              <w:pStyle w:val="user1"/>
+            <w:tcW w:w="1454" w:type="dxa"/>
+            <w:tcBorders>
+              <w:left w:val="single" w:sz="4" w:space="0" w:color="000000"/>
+              <w:bottom w:val="single" w:sz="4" w:space="0" w:color="000000"/>
+            </w:tcBorders>
+            <w:vAlign w:val="center"/>
+          </w:tcPr>
+          <w:p>
+            <w:pPr>
+              <w:pStyle w:val="af8"/>
               <w:rPr>
                 <w:rFonts w:ascii="標楷體" w:eastAsia="標楷體" w:hAnsi="標楷體"/>
               </w:rPr>
@@ -1215,16 +1215,16 @@
         </w:tc>
         <w:tc>
           <w:tcPr>
-            <w:tcW w:w="1474" w:type="dxa"/>
-            <w:tcBorders>
-              <w:left w:val="single" w:sz="4" w:space="0" w:color="000000"/>
-              <w:bottom w:val="single" w:sz="4" w:space="0" w:color="000000"/>
-            </w:tcBorders>
-            <w:vAlign w:val="center"/>
-          </w:tcPr>
-          <w:p>
-            <w:pPr>
-              <w:pStyle w:val="user1"/>
+            <w:tcW w:w="1455" w:type="dxa"/>
+            <w:tcBorders>
+              <w:left w:val="single" w:sz="4" w:space="0" w:color="000000"/>
+              <w:bottom w:val="single" w:sz="4" w:space="0" w:color="000000"/>
+            </w:tcBorders>
+            <w:vAlign w:val="center"/>
+          </w:tcPr>
+          <w:p>
+            <w:pPr>
+              <w:pStyle w:val="af8"/>
               <w:rPr>
                 <w:rFonts w:ascii="標楷體" w:eastAsia="標楷體" w:hAnsi="標楷體"/>
               </w:rPr>
@@ -1233,16 +1233,16 @@
         </w:tc>
         <w:tc>
           <w:tcPr>
-            <w:tcW w:w="1474" w:type="dxa"/>
-            <w:tcBorders>
-              <w:left w:val="single" w:sz="4" w:space="0" w:color="000000"/>
-              <w:bottom w:val="single" w:sz="4" w:space="0" w:color="000000"/>
-            </w:tcBorders>
-            <w:vAlign w:val="center"/>
-          </w:tcPr>
-          <w:p>
-            <w:pPr>
-              <w:pStyle w:val="user1"/>
+            <w:tcW w:w="1455" w:type="dxa"/>
+            <w:tcBorders>
+              <w:left w:val="single" w:sz="4" w:space="0" w:color="000000"/>
+              <w:bottom w:val="single" w:sz="4" w:space="0" w:color="000000"/>
+            </w:tcBorders>
+            <w:vAlign w:val="center"/>
+          </w:tcPr>
+          <w:p>
+            <w:pPr>
+              <w:pStyle w:val="af8"/>
               <w:rPr>
                 <w:rFonts w:ascii="標楷體" w:eastAsia="標楷體" w:hAnsi="標楷體"/>
               </w:rPr>
@@ -1251,16 +1251,16 @@
         </w:tc>
         <w:tc>
           <w:tcPr>
-            <w:tcW w:w="1007" w:type="dxa"/>
-            <w:tcBorders>
-              <w:left w:val="single" w:sz="4" w:space="0" w:color="000000"/>
-              <w:bottom w:val="single" w:sz="4" w:space="0" w:color="000000"/>
-            </w:tcBorders>
-            <w:vAlign w:val="center"/>
-          </w:tcPr>
-          <w:p>
-            <w:pPr>
-              <w:pStyle w:val="user1"/>
+            <w:tcW w:w="996" w:type="dxa"/>
+            <w:tcBorders>
+              <w:left w:val="single" w:sz="4" w:space="0" w:color="000000"/>
+              <w:bottom w:val="single" w:sz="4" w:space="0" w:color="000000"/>
+            </w:tcBorders>
+            <w:vAlign w:val="center"/>
+          </w:tcPr>
+          <w:p>
+            <w:pPr>
+              <w:pStyle w:val="af8"/>
               <w:rPr>
                 <w:rFonts w:ascii="標楷體" w:eastAsia="標楷體" w:hAnsi="標楷體"/>
               </w:rPr>
@@ -1269,16 +1269,16 @@
         </w:tc>
         <w:tc>
           <w:tcPr>
-            <w:tcW w:w="1544" w:type="dxa"/>
-            <w:tcBorders>
-              <w:left w:val="single" w:sz="4" w:space="0" w:color="000000"/>
-              <w:bottom w:val="single" w:sz="4" w:space="0" w:color="000000"/>
-            </w:tcBorders>
-            <w:vAlign w:val="center"/>
-          </w:tcPr>
-          <w:p>
-            <w:pPr>
-              <w:pStyle w:val="user1"/>
+            <w:tcW w:w="1524" w:type="dxa"/>
+            <w:tcBorders>
+              <w:left w:val="single" w:sz="4" w:space="0" w:color="000000"/>
+              <w:bottom w:val="single" w:sz="4" w:space="0" w:color="000000"/>
+            </w:tcBorders>
+            <w:vAlign w:val="center"/>
+          </w:tcPr>
+          <w:p>
+            <w:pPr>
+              <w:pStyle w:val="af8"/>
               <w:rPr>
                 <w:rFonts w:ascii="標楷體" w:eastAsia="標楷體" w:hAnsi="標楷體"/>
               </w:rPr>
@@ -1287,7 +1287,7 @@
         </w:tc>
         <w:tc>
           <w:tcPr>
-            <w:tcW w:w="625" w:type="dxa"/>
+            <w:tcW w:w="618" w:type="dxa"/>
             <w:tcBorders>
               <w:left w:val="single" w:sz="4" w:space="0" w:color="000000"/>
               <w:bottom w:val="single" w:sz="4" w:space="0" w:color="000000"/>
@@ -1297,7 +1297,7 @@
           </w:tcPr>
           <w:p>
             <w:pPr>
-              <w:pStyle w:val="user1"/>
+              <w:pStyle w:val="af8"/>
               <w:rPr>
                 <w:rFonts w:ascii="標楷體" w:eastAsia="標楷體" w:hAnsi="標楷體"/>
               </w:rPr>
@@ -1308,7 +1308,7 @@
     </w:tbl>
     <w:p>
       <w:pPr>
-        <w:pStyle w:val="ad"/>
+        <w:pStyle w:val="ac"/>
       </w:pPr>
     </w:p>
     <w:sectPr>
@@ -1348,7 +1348,7 @@
 <w:ftr xmlns:wpc="http://schemas.microsoft.com/office/word/2010/wordprocessingCanvas" xmlns:cx="http://schemas.microsoft.com/office/drawing/2014/chartex" xmlns:cx1="http://schemas.microsoft.com/office/drawing/2015/9/8/chartex" xmlns:cx2="http://schemas.microsoft.com/office/drawing/2015/10/21/chartex" xmlns:cx3="http://schemas.microsoft.com/office/drawing/2016/5/9/chartex" xmlns:cx4="http://schemas.microsoft.com/office/drawing/2016/5/10/chartex" xmlns:cx5="http://schemas.microsoft.com/office/drawing/2016/5/11/chartex" xmlns:cx6="http://schemas.microsoft.com/office/drawing/2016/5/12/chartex" xmlns:cx7="http://schemas.microsoft.com/office/drawing/2016/5/13/chartex" xmlns:cx8="http://schemas.microsoft.com/office/drawing/2016/5/14/chartex" xmlns:mc="http://schemas.openxmlformats.org/markup-compatibility/2006" xmlns:aink="http://schemas.microsoft.com/office/drawing/2016/ink" xmlns:am3d="http://schemas.microsoft.com/office/drawing/2017/model3d" xmlns:o="urn:schemas-microsoft-com:office:office" xmlns:oel="http://schemas.microsoft.com/office/2019/extlst" xmlns:r="http://schemas.openxmlformats.org/officeDocument/2006/relationships" xmlns:m="http://schemas.openxmlformats.org/officeDocument/2006/math" xmlns:v="urn:schemas-microsoft-com:vml" xmlns:wp14="http://schemas.microsoft.com/office/word/2010/wordprocessingDrawing" xmlns:wp="http://schemas.openxmlformats.org/drawingml/2006/wordprocessingDrawing" xmlns:w10="urn:schemas-microsoft-com:office:word" xmlns:w="http://schemas.openxmlformats.org/wordprocessingml/2006/main" xmlns:w14="http://schemas.microsoft.com/office/word/2010/wordml" xmlns:w15="http://schemas.microsoft.com/office/word/2012/wordml" xmlns:w16cex="http://schemas.microsoft.com/office/word/2018/wordml/cex" xmlns:w16cid="http://schemas.microsoft.com/office/word/2016/wordml/cid" xmlns:w16="http://schemas.microsoft.com/office/word/2018/wordml" xmlns:w16sdtdh="http://schemas.microsoft.com/office/word/2020/wordml/sdtdatahash" xmlns:w16se="http://schemas.microsoft.com/office/word/2015/wordml/symex" xmlns:wpg="http://schemas.microsoft.com/office/word/2010/wordprocessingGroup" xmlns:wpi="http://schemas.microsoft.com/office/word/2010/wordprocessingInk" xmlns:wne="http://schemas.microsoft.com/office/word/2006/wordml" xmlns:wps="http://schemas.microsoft.com/office/word/2010/wordprocessingShape" mc:Ignorable="w14 w15 w16se w16cid w16 w16cex w16sdtdh wp14">
   <w:p>
     <w:pPr>
-      <w:pStyle w:val="af3"/>
+      <w:pStyle w:val="af2"/>
     </w:pPr>
   </w:p>
   <w:p/>
@@ -1359,7 +1359,7 @@
 <w:ftr xmlns:wpc="http://schemas.microsoft.com/office/word/2010/wordprocessingCanvas" xmlns:cx="http://schemas.microsoft.com/office/drawing/2014/chartex" xmlns:cx1="http://schemas.microsoft.com/office/drawing/2015/9/8/chartex" xmlns:cx2="http://schemas.microsoft.com/office/drawing/2015/10/21/chartex" xmlns:cx3="http://schemas.microsoft.com/office/drawing/2016/5/9/chartex" xmlns:cx4="http://schemas.microsoft.com/office/drawing/2016/5/10/chartex" xmlns:cx5="http://schemas.microsoft.com/office/drawing/2016/5/11/chartex" xmlns:cx6="http://schemas.microsoft.com/office/drawing/2016/5/12/chartex" xmlns:cx7="http://schemas.microsoft.com/office/drawing/2016/5/13/chartex" xmlns:cx8="http://schemas.microsoft.com/office/drawing/2016/5/14/chartex" xmlns:mc="http://schemas.openxmlformats.org/markup-compatibility/2006" xmlns:aink="http://schemas.microsoft.com/office/drawing/2016/ink" xmlns:am3d="http://schemas.microsoft.com/office/drawing/2017/model3d" xmlns:o="urn:schemas-microsoft-com:office:office" xmlns:oel="http://schemas.microsoft.com/office/2019/extlst" xmlns:r="http://schemas.openxmlformats.org/officeDocument/2006/relationships" xmlns:m="http://schemas.openxmlformats.org/officeDocument/2006/math" xmlns:v="urn:schemas-microsoft-com:vml" xmlns:wp14="http://schemas.microsoft.com/office/word/2010/wordprocessingDrawing" xmlns:wp="http://schemas.openxmlformats.org/drawingml/2006/wordprocessingDrawing" xmlns:w10="urn:schemas-microsoft-com:office:word" xmlns:w="http://schemas.openxmlformats.org/wordprocessingml/2006/main" xmlns:w14="http://schemas.microsoft.com/office/word/2010/wordml" xmlns:w15="http://schemas.microsoft.com/office/word/2012/wordml" xmlns:w16cex="http://schemas.microsoft.com/office/word/2018/wordml/cex" xmlns:w16cid="http://schemas.microsoft.com/office/word/2016/wordml/cid" xmlns:w16="http://schemas.microsoft.com/office/word/2018/wordml" xmlns:w16sdtdh="http://schemas.microsoft.com/office/word/2020/wordml/sdtdatahash" xmlns:w16se="http://schemas.microsoft.com/office/word/2015/wordml/symex" xmlns:wpg="http://schemas.microsoft.com/office/word/2010/wordprocessingGroup" xmlns:wpi="http://schemas.microsoft.com/office/word/2010/wordprocessingInk" xmlns:wne="http://schemas.microsoft.com/office/word/2006/wordml" xmlns:wps="http://schemas.microsoft.com/office/word/2010/wordprocessingShape" mc:Ignorable="w14 w15 w16se w16cid w16 w16cex w16sdtdh wp14">
   <w:p>
     <w:pPr>
-      <w:pStyle w:val="af3"/>
+      <w:pStyle w:val="af2"/>
     </w:pPr>
     <w:r>
       <w:fldChar w:fldCharType="begin"/>
@@ -1371,13 +1371,12 @@
       <w:fldChar w:fldCharType="separate"/>
     </w:r>
     <w:r>
-      <w:t>2</w:t>
+      <w:t>1</w:t>
     </w:r>
     <w:r>
       <w:fldChar w:fldCharType="end"/>
     </w:r>
   </w:p>
-  <w:p/>
 </w:ftr>
 </file>
 
@@ -1385,7 +1384,7 @@
 <w:ftr xmlns:wpc="http://schemas.microsoft.com/office/word/2010/wordprocessingCanvas" xmlns:cx="http://schemas.microsoft.com/office/drawing/2014/chartex" xmlns:cx1="http://schemas.microsoft.com/office/drawing/2015/9/8/chartex" xmlns:cx2="http://schemas.microsoft.com/office/drawing/2015/10/21/chartex" xmlns:cx3="http://schemas.microsoft.com/office/drawing/2016/5/9/chartex" xmlns:cx4="http://schemas.microsoft.com/office/drawing/2016/5/10/chartex" xmlns:cx5="http://schemas.microsoft.com/office/drawing/2016/5/11/chartex" xmlns:cx6="http://schemas.microsoft.com/office/drawing/2016/5/12/chartex" xmlns:cx7="http://schemas.microsoft.com/office/drawing/2016/5/13/chartex" xmlns:cx8="http://schemas.microsoft.com/office/drawing/2016/5/14/chartex" xmlns:mc="http://schemas.openxmlformats.org/markup-compatibility/2006" xmlns:aink="http://schemas.microsoft.com/office/drawing/2016/ink" xmlns:am3d="http://schemas.microsoft.com/office/drawing/2017/model3d" xmlns:o="urn:schemas-microsoft-com:office:office" xmlns:oel="http://schemas.microsoft.com/office/2019/extlst" xmlns:r="http://schemas.openxmlformats.org/officeDocument/2006/relationships" xmlns:m="http://schemas.openxmlformats.org/officeDocument/2006/math" xmlns:v="urn:schemas-microsoft-com:vml" xmlns:wp14="http://schemas.microsoft.com/office/word/2010/wordprocessingDrawing" xmlns:wp="http://schemas.openxmlformats.org/drawingml/2006/wordprocessingDrawing" xmlns:w10="urn:schemas-microsoft-com:office:word" xmlns:w="http://schemas.openxmlformats.org/wordprocessingml/2006/main" xmlns:w14="http://schemas.microsoft.com/office/word/2010/wordml" xmlns:w15="http://schemas.microsoft.com/office/word/2012/wordml" xmlns:w16cex="http://schemas.microsoft.com/office/word/2018/wordml/cex" xmlns:w16cid="http://schemas.microsoft.com/office/word/2016/wordml/cid" xmlns:w16="http://schemas.microsoft.com/office/word/2018/wordml" xmlns:w16sdtdh="http://schemas.microsoft.com/office/word/2020/wordml/sdtdatahash" xmlns:w16se="http://schemas.microsoft.com/office/word/2015/wordml/symex" xmlns:wpg="http://schemas.microsoft.com/office/word/2010/wordprocessingGroup" xmlns:wpi="http://schemas.microsoft.com/office/word/2010/wordprocessingInk" xmlns:wne="http://schemas.microsoft.com/office/word/2006/wordml" xmlns:wps="http://schemas.microsoft.com/office/word/2010/wordprocessingShape" mc:Ignorable="w14 w15 w16se w16cid w16 w16cex w16sdtdh wp14">
   <w:p>
     <w:pPr>
-      <w:pStyle w:val="af3"/>
+      <w:pStyle w:val="af2"/>
     </w:pPr>
     <w:r>
       <w:fldChar w:fldCharType="begin"/>
@@ -1397,13 +1396,12 @@
       <w:fldChar w:fldCharType="separate"/>
     </w:r>
     <w:r>
-      <w:t>2</w:t>
+      <w:t>1</w:t>
     </w:r>
     <w:r>
       <w:fldChar w:fldCharType="end"/>
     </w:r>
   </w:p>
-  <w:p/>
 </w:ftr>
 </file>
 
@@ -1429,9 +1427,131 @@
 <file path=word/numbering.xml><?xml version="1.0" encoding="utf-8"?>
 <w:numbering xmlns:wpc="http://schemas.microsoft.com/office/word/2010/wordprocessingCanvas" xmlns:cx="http://schemas.microsoft.com/office/drawing/2014/chartex" xmlns:cx1="http://schemas.microsoft.com/office/drawing/2015/9/8/chartex" xmlns:cx2="http://schemas.microsoft.com/office/drawing/2015/10/21/chartex" xmlns:cx3="http://schemas.microsoft.com/office/drawing/2016/5/9/chartex" xmlns:cx4="http://schemas.microsoft.com/office/drawing/2016/5/10/chartex" xmlns:cx5="http://schemas.microsoft.com/office/drawing/2016/5/11/chartex" xmlns:cx6="http://schemas.microsoft.com/office/drawing/2016/5/12/chartex" xmlns:cx7="http://schemas.microsoft.com/office/drawing/2016/5/13/chartex" xmlns:cx8="http://schemas.microsoft.com/office/drawing/2016/5/14/chartex" xmlns:mc="http://schemas.openxmlformats.org/markup-compatibility/2006" xmlns:aink="http://schemas.microsoft.com/office/drawing/2016/ink" xmlns:am3d="http://schemas.microsoft.com/office/drawing/2017/model3d" xmlns:o="urn:schemas-microsoft-com:office:office" xmlns:oel="http://schemas.microsoft.com/office/2019/extlst" xmlns:r="http://schemas.openxmlformats.org/officeDocument/2006/relationships" xmlns:m="http://schemas.openxmlformats.org/officeDocument/2006/math" xmlns:v="urn:schemas-microsoft-com:vml" xmlns:wp14="http://schemas.microsoft.com/office/word/2010/wordprocessingDrawing" xmlns:wp="http://schemas.openxmlformats.org/drawingml/2006/wordprocessingDrawing" xmlns:w10="urn:schemas-microsoft-com:office:word" xmlns:w="http://schemas.openxmlformats.org/wordprocessingml/2006/main" xmlns:w14="http://schemas.microsoft.com/office/word/2010/wordml" xmlns:w15="http://schemas.microsoft.com/office/word/2012/wordml" xmlns:w16cex="http://schemas.microsoft.com/office/word/2018/wordml/cex" xmlns:w16cid="http://schemas.microsoft.com/office/word/2016/wordml/cid" xmlns:w16="http://schemas.microsoft.com/office/word/2018/wordml" xmlns:w16sdtdh="http://schemas.microsoft.com/office/word/2020/wordml/sdtdatahash" xmlns:w16se="http://schemas.microsoft.com/office/word/2015/wordml/symex" xmlns:wpg="http://schemas.microsoft.com/office/word/2010/wordprocessingGroup" xmlns:wpi="http://schemas.microsoft.com/office/word/2010/wordprocessingInk" xmlns:wne="http://schemas.microsoft.com/office/word/2006/wordml" xmlns:wps="http://schemas.microsoft.com/office/word/2010/wordprocessingShape" mc:Ignorable="w14 w15 w16se w16cid w16 w16cex w16sdtdh wp14">
   <w:abstractNum w:abstractNumId="0" w15:restartNumberingAfterBreak="0">
-    <w:nsid w:val="044D28EE"/>
+    <w:nsid w:val="2298607D"/>
     <w:multiLevelType w:val="multilevel"/>
-    <w:tmpl w:val="4A1691D6"/>
+    <w:tmpl w:val="A8B264B6"/>
+    <w:lvl w:ilvl="0">
+      <w:start w:val="1"/>
+      <w:numFmt w:val="none"/>
+      <w:suff w:val="nothing"/>
+      <w:lvlText w:val=""/>
+      <w:lvlJc w:val="left"/>
+      <w:pPr>
+        <w:tabs>
+          <w:tab w:val="num" w:pos="0"/>
+        </w:tabs>
+        <w:ind w:left="0" w:firstLine="0"/>
+      </w:pPr>
+    </w:lvl>
+    <w:lvl w:ilvl="1">
+      <w:start w:val="1"/>
+      <w:numFmt w:val="none"/>
+      <w:suff w:val="nothing"/>
+      <w:lvlText w:val=""/>
+      <w:lvlJc w:val="left"/>
+      <w:pPr>
+        <w:tabs>
+          <w:tab w:val="num" w:pos="0"/>
+        </w:tabs>
+        <w:ind w:left="0" w:firstLine="0"/>
+      </w:pPr>
+    </w:lvl>
+    <w:lvl w:ilvl="2">
+      <w:start w:val="1"/>
+      <w:numFmt w:val="none"/>
+      <w:suff w:val="nothing"/>
+      <w:lvlText w:val=""/>
+      <w:lvlJc w:val="left"/>
+      <w:pPr>
+        <w:tabs>
+          <w:tab w:val="num" w:pos="0"/>
+        </w:tabs>
+        <w:ind w:left="0" w:firstLine="0"/>
+      </w:pPr>
+    </w:lvl>
+    <w:lvl w:ilvl="3">
+      <w:start w:val="1"/>
+      <w:numFmt w:val="none"/>
+      <w:suff w:val="nothing"/>
+      <w:lvlText w:val=""/>
+      <w:lvlJc w:val="left"/>
+      <w:pPr>
+        <w:tabs>
+          <w:tab w:val="num" w:pos="0"/>
+        </w:tabs>
+        <w:ind w:left="0" w:firstLine="0"/>
+      </w:pPr>
+    </w:lvl>
+    <w:lvl w:ilvl="4">
+      <w:start w:val="1"/>
+      <w:numFmt w:val="none"/>
+      <w:suff w:val="nothing"/>
+      <w:lvlText w:val=""/>
+      <w:lvlJc w:val="left"/>
+      <w:pPr>
+        <w:tabs>
+          <w:tab w:val="num" w:pos="0"/>
+        </w:tabs>
+        <w:ind w:left="0" w:firstLine="0"/>
+      </w:pPr>
+    </w:lvl>
+    <w:lvl w:ilvl="5">
+      <w:start w:val="1"/>
+      <w:numFmt w:val="none"/>
+      <w:suff w:val="nothing"/>
+      <w:lvlText w:val=""/>
+      <w:lvlJc w:val="left"/>
+      <w:pPr>
+        <w:tabs>
+          <w:tab w:val="num" w:pos="0"/>
+        </w:tabs>
+        <w:ind w:left="0" w:firstLine="0"/>
+      </w:pPr>
+    </w:lvl>
+    <w:lvl w:ilvl="6">
+      <w:start w:val="1"/>
+      <w:numFmt w:val="none"/>
+      <w:suff w:val="nothing"/>
+      <w:lvlText w:val=""/>
+      <w:lvlJc w:val="left"/>
+      <w:pPr>
+        <w:tabs>
+          <w:tab w:val="num" w:pos="0"/>
+        </w:tabs>
+        <w:ind w:left="0" w:firstLine="0"/>
+      </w:pPr>
+    </w:lvl>
+    <w:lvl w:ilvl="7">
+      <w:start w:val="1"/>
+      <w:numFmt w:val="none"/>
+      <w:suff w:val="nothing"/>
+      <w:lvlText w:val=""/>
+      <w:lvlJc w:val="left"/>
+      <w:pPr>
+        <w:tabs>
+          <w:tab w:val="num" w:pos="0"/>
+        </w:tabs>
+        <w:ind w:left="0" w:firstLine="0"/>
+      </w:pPr>
+    </w:lvl>
+    <w:lvl w:ilvl="8">
+      <w:start w:val="1"/>
+      <w:numFmt w:val="none"/>
+      <w:suff w:val="nothing"/>
+      <w:lvlText w:val=""/>
+      <w:lvlJc w:val="left"/>
+      <w:pPr>
+        <w:tabs>
+          <w:tab w:val="num" w:pos="0"/>
+        </w:tabs>
+        <w:ind w:left="0" w:firstLine="0"/>
+      </w:pPr>
+    </w:lvl>
+  </w:abstractNum>
+  <w:abstractNum w:abstractNumId="1" w15:restartNumberingAfterBreak="0">
+    <w:nsid w:val="2A687FD5"/>
+    <w:multiLevelType w:val="multilevel"/>
+    <w:tmpl w:val="7B725DFA"/>
     <w:lvl w:ilvl="0">
       <w:start w:val="1"/>
       <w:numFmt w:val="taiwaneseCountingThousand"/>
@@ -1573,10 +1693,10 @@
       </w:rPr>
     </w:lvl>
   </w:abstractNum>
-  <w:abstractNum w:abstractNumId="1" w15:restartNumberingAfterBreak="0">
-    <w:nsid w:val="20213A7C"/>
+  <w:abstractNum w:abstractNumId="2" w15:restartNumberingAfterBreak="0">
+    <w:nsid w:val="3D5A5E64"/>
     <w:multiLevelType w:val="multilevel"/>
-    <w:tmpl w:val="AF500102"/>
+    <w:tmpl w:val="F75402E8"/>
     <w:lvl w:ilvl="0">
       <w:start w:val="1"/>
       <w:numFmt w:val="none"/>
@@ -1695,132 +1815,10 @@
       </w:pPr>
     </w:lvl>
   </w:abstractNum>
-  <w:abstractNum w:abstractNumId="2" w15:restartNumberingAfterBreak="0">
-    <w:nsid w:val="436B2401"/>
+  <w:abstractNum w:abstractNumId="3" w15:restartNumberingAfterBreak="0">
+    <w:nsid w:val="4B7D3CE2"/>
     <w:multiLevelType w:val="multilevel"/>
-    <w:tmpl w:val="C5001BFA"/>
-    <w:lvl w:ilvl="0">
-      <w:start w:val="1"/>
-      <w:numFmt w:val="none"/>
-      <w:suff w:val="nothing"/>
-      <w:lvlText w:val=""/>
-      <w:lvlJc w:val="left"/>
-      <w:pPr>
-        <w:tabs>
-          <w:tab w:val="num" w:pos="0"/>
-        </w:tabs>
-        <w:ind w:left="0" w:firstLine="0"/>
-      </w:pPr>
-    </w:lvl>
-    <w:lvl w:ilvl="1">
-      <w:start w:val="1"/>
-      <w:numFmt w:val="none"/>
-      <w:suff w:val="nothing"/>
-      <w:lvlText w:val=""/>
-      <w:lvlJc w:val="left"/>
-      <w:pPr>
-        <w:tabs>
-          <w:tab w:val="num" w:pos="0"/>
-        </w:tabs>
-        <w:ind w:left="0" w:firstLine="0"/>
-      </w:pPr>
-    </w:lvl>
-    <w:lvl w:ilvl="2">
-      <w:start w:val="1"/>
-      <w:numFmt w:val="none"/>
-      <w:suff w:val="nothing"/>
-      <w:lvlText w:val=""/>
-      <w:lvlJc w:val="left"/>
-      <w:pPr>
-        <w:tabs>
-          <w:tab w:val="num" w:pos="0"/>
-        </w:tabs>
-        <w:ind w:left="0" w:firstLine="0"/>
-      </w:pPr>
-    </w:lvl>
-    <w:lvl w:ilvl="3">
-      <w:start w:val="1"/>
-      <w:numFmt w:val="none"/>
-      <w:suff w:val="nothing"/>
-      <w:lvlText w:val=""/>
-      <w:lvlJc w:val="left"/>
-      <w:pPr>
-        <w:tabs>
-          <w:tab w:val="num" w:pos="0"/>
-        </w:tabs>
-        <w:ind w:left="0" w:firstLine="0"/>
-      </w:pPr>
-    </w:lvl>
-    <w:lvl w:ilvl="4">
-      <w:start w:val="1"/>
-      <w:numFmt w:val="none"/>
-      <w:suff w:val="nothing"/>
-      <w:lvlText w:val=""/>
-      <w:lvlJc w:val="left"/>
-      <w:pPr>
-        <w:tabs>
-          <w:tab w:val="num" w:pos="0"/>
-        </w:tabs>
-        <w:ind w:left="0" w:firstLine="0"/>
-      </w:pPr>
-    </w:lvl>
-    <w:lvl w:ilvl="5">
-      <w:start w:val="1"/>
-      <w:numFmt w:val="none"/>
-      <w:suff w:val="nothing"/>
-      <w:lvlText w:val=""/>
-      <w:lvlJc w:val="left"/>
-      <w:pPr>
-        <w:tabs>
-          <w:tab w:val="num" w:pos="0"/>
-        </w:tabs>
-        <w:ind w:left="0" w:firstLine="0"/>
-      </w:pPr>
-    </w:lvl>
-    <w:lvl w:ilvl="6">
-      <w:start w:val="1"/>
-      <w:numFmt w:val="none"/>
-      <w:suff w:val="nothing"/>
-      <w:lvlText w:val=""/>
-      <w:lvlJc w:val="left"/>
-      <w:pPr>
-        <w:tabs>
-          <w:tab w:val="num" w:pos="0"/>
-        </w:tabs>
-        <w:ind w:left="0" w:firstLine="0"/>
-      </w:pPr>
-    </w:lvl>
-    <w:lvl w:ilvl="7">
-      <w:start w:val="1"/>
-      <w:numFmt w:val="none"/>
-      <w:suff w:val="nothing"/>
-      <w:lvlText w:val=""/>
-      <w:lvlJc w:val="left"/>
-      <w:pPr>
-        <w:tabs>
-          <w:tab w:val="num" w:pos="0"/>
-        </w:tabs>
-        <w:ind w:left="0" w:firstLine="0"/>
-      </w:pPr>
-    </w:lvl>
-    <w:lvl w:ilvl="8">
-      <w:start w:val="1"/>
-      <w:numFmt w:val="none"/>
-      <w:suff w:val="nothing"/>
-      <w:lvlText w:val=""/>
-      <w:lvlJc w:val="left"/>
-      <w:pPr>
-        <w:tabs>
-          <w:tab w:val="num" w:pos="0"/>
-        </w:tabs>
-        <w:ind w:left="0" w:firstLine="0"/>
-      </w:pPr>
-    </w:lvl>
-  </w:abstractNum>
-  <w:abstractNum w:abstractNumId="3" w15:restartNumberingAfterBreak="0">
-    <w:nsid w:val="48CC7B8E"/>
-    <w:multiLevelType w:val="multilevel"/>
-    <w:tmpl w:val="96328FD4"/>
+    <w:tmpl w:val="D7D0F948"/>
     <w:lvl w:ilvl="0">
       <w:start w:val="1"/>
       <w:numFmt w:val="bullet"/>
@@ -1958,17 +1956,17 @@
       </w:rPr>
     </w:lvl>
   </w:abstractNum>
-  <w:num w:numId="1" w16cid:durableId="532378194">
-    <w:abstractNumId w:val="0"/>
+  <w:num w:numId="1" w16cid:durableId="1571192473">
+    <w:abstractNumId w:val="1"/>
   </w:num>
-  <w:num w:numId="2" w16cid:durableId="643051206">
+  <w:num w:numId="2" w16cid:durableId="617569400">
     <w:abstractNumId w:val="3"/>
   </w:num>
-  <w:num w:numId="3" w16cid:durableId="1271939759">
-    <w:abstractNumId w:val="1"/>
+  <w:num w:numId="3" w16cid:durableId="1613898415">
+    <w:abstractNumId w:val="2"/>
   </w:num>
-  <w:num w:numId="4" w16cid:durableId="1814367570">
-    <w:abstractNumId w:val="2"/>
+  <w:num w:numId="4" w16cid:durableId="1140223684">
+    <w:abstractNumId w:val="0"/>
   </w:num>
 </w:numbering>
 </file>
@@ -2404,11 +2402,11 @@
     <w:semiHidden/>
     <w:unhideWhenUsed/>
   </w:style>
-  <w:style w:type="character" w:customStyle="1" w:styleId="a5">
-    <w:name w:val="編號字元"/>
-    <w:qFormat/>
-  </w:style>
-  <w:style w:type="character" w:styleId="a6">
+  <w:style w:type="character" w:customStyle="1" w:styleId="user">
+    <w:name w:val="編號字元 (user)"/>
+    <w:qFormat/>
+  </w:style>
+  <w:style w:type="character" w:styleId="a5">
     <w:name w:val="line number"/>
     <w:rPr>
       <w:rFonts w:eastAsia="標楷體"/>
@@ -2416,16 +2414,16 @@
       <w:sz w:val="20"/>
     </w:rPr>
   </w:style>
-  <w:style w:type="character" w:styleId="a7">
+  <w:style w:type="character" w:styleId="a6">
     <w:name w:val="page number"/>
     <w:rPr>
       <w:rFonts w:eastAsia="標楷體"/>
     </w:rPr>
   </w:style>
-  <w:style w:type="paragraph" w:styleId="a8">
+  <w:style w:type="paragraph" w:styleId="a7">
     <w:name w:val="Title"/>
     <w:basedOn w:val="a1"/>
-    <w:next w:val="a9"/>
+    <w:next w:val="a8"/>
     <w:uiPriority w:val="10"/>
     <w:qFormat/>
     <w:pPr>
@@ -2438,18 +2436,18 @@
       <w:szCs w:val="28"/>
     </w:rPr>
   </w:style>
-  <w:style w:type="paragraph" w:styleId="a9">
+  <w:style w:type="paragraph" w:styleId="a8">
     <w:name w:val="Body Text"/>
     <w:basedOn w:val="a1"/>
     <w:pPr>
       <w:spacing w:after="140" w:line="276" w:lineRule="auto"/>
     </w:pPr>
   </w:style>
+  <w:style w:type="paragraph" w:styleId="a9">
+    <w:name w:val="List"/>
+    <w:basedOn w:val="a8"/>
+  </w:style>
   <w:style w:type="paragraph" w:styleId="aa">
-    <w:name w:val="List"/>
-    <w:basedOn w:val="a9"/>
-  </w:style>
-  <w:style w:type="paragraph" w:styleId="ab">
     <w:name w:val="caption"/>
     <w:basedOn w:val="a1"/>
     <w:qFormat/>
@@ -2462,7 +2460,7 @@
       <w:iCs/>
     </w:rPr>
   </w:style>
-  <w:style w:type="paragraph" w:customStyle="1" w:styleId="ac">
+  <w:style w:type="paragraph" w:customStyle="1" w:styleId="ab">
     <w:name w:val="索引"/>
     <w:basedOn w:val="a1"/>
     <w:qFormat/>
@@ -2470,7 +2468,7 @@
       <w:suppressLineNumbers/>
     </w:pPr>
   </w:style>
-  <w:style w:type="paragraph" w:customStyle="1" w:styleId="user">
+  <w:style w:type="paragraph" w:customStyle="1" w:styleId="user0">
     <w:name w:val="索引 (user)"/>
     <w:basedOn w:val="a1"/>
     <w:qFormat/>
@@ -2481,7 +2479,7 @@
   <w:style w:type="paragraph" w:customStyle="1" w:styleId="10">
     <w:name w:val="標題1"/>
     <w:basedOn w:val="a1"/>
-    <w:next w:val="a9"/>
+    <w:next w:val="a8"/>
     <w:qFormat/>
     <w:pPr>
       <w:keepNext/>
@@ -2511,7 +2509,7 @@
       <w:sz w:val="28"/>
     </w:rPr>
   </w:style>
-  <w:style w:type="paragraph" w:customStyle="1" w:styleId="ad">
+  <w:style w:type="paragraph" w:customStyle="1" w:styleId="ac">
     <w:name w:val="書狀_預設"/>
     <w:qFormat/>
     <w:pPr>
@@ -2559,9 +2557,9 @@
       <w:szCs w:val="28"/>
     </w:rPr>
   </w:style>
-  <w:style w:type="paragraph" w:customStyle="1" w:styleId="ae">
+  <w:style w:type="paragraph" w:customStyle="1" w:styleId="ad">
     <w:name w:val="書狀_標題"/>
-    <w:basedOn w:val="ad"/>
+    <w:basedOn w:val="ac"/>
     <w:qFormat/>
     <w:pPr>
       <w:spacing w:line="240" w:lineRule="auto"/>
@@ -2573,7 +2571,7 @@
   </w:style>
   <w:style w:type="paragraph" w:customStyle="1" w:styleId="a0">
     <w:name w:val="書狀_清單"/>
-    <w:basedOn w:val="ad"/>
+    <w:basedOn w:val="ac"/>
     <w:qFormat/>
     <w:pPr>
       <w:numPr>
@@ -2582,25 +2580,25 @@
       </w:numPr>
     </w:pPr>
   </w:style>
+  <w:style w:type="paragraph" w:customStyle="1" w:styleId="ae">
+    <w:name w:val="書狀_簽章"/>
+    <w:basedOn w:val="ac"/>
+    <w:qFormat/>
+    <w:pPr>
+      <w:ind w:left="3402"/>
+    </w:pPr>
+  </w:style>
   <w:style w:type="paragraph" w:customStyle="1" w:styleId="af">
-    <w:name w:val="書狀_簽章"/>
-    <w:basedOn w:val="ad"/>
-    <w:qFormat/>
-    <w:pPr>
-      <w:ind w:left="3402"/>
+    <w:name w:val="書狀_證據編號"/>
+    <w:basedOn w:val="ac"/>
+    <w:qFormat/>
+    <w:pPr>
+      <w:ind w:left="1050" w:hanging="1050"/>
     </w:pPr>
   </w:style>
   <w:style w:type="paragraph" w:customStyle="1" w:styleId="af0">
-    <w:name w:val="書狀_證據編號"/>
-    <w:basedOn w:val="ad"/>
-    <w:qFormat/>
-    <w:pPr>
-      <w:ind w:left="1050" w:hanging="1050"/>
-    </w:pPr>
-  </w:style>
-  <w:style w:type="paragraph" w:customStyle="1" w:styleId="af1">
     <w:name w:val="書狀_謹狀"/>
-    <w:basedOn w:val="ad"/>
+    <w:basedOn w:val="ac"/>
     <w:qFormat/>
     <w:pPr>
       <w:ind w:left="567"/>
@@ -2609,37 +2607,37 @@
       <w:spacing w:val="560"/>
     </w:rPr>
   </w:style>
-  <w:style w:type="paragraph" w:customStyle="1" w:styleId="user0">
+  <w:style w:type="paragraph" w:customStyle="1" w:styleId="af1">
+    <w:name w:val="頁首與頁尾"/>
+    <w:basedOn w:val="a1"/>
+    <w:qFormat/>
+    <w:pPr>
+      <w:suppressLineNumbers/>
+    </w:pPr>
+  </w:style>
+  <w:style w:type="paragraph" w:customStyle="1" w:styleId="user1">
     <w:name w:val="頁首與頁尾 (user)"/>
     <w:basedOn w:val="a1"/>
     <w:qFormat/>
-    <w:pPr>
-      <w:suppressLineNumbers/>
-    </w:pPr>
-  </w:style>
-  <w:style w:type="paragraph" w:customStyle="1" w:styleId="af2">
-    <w:name w:val="頁首與頁尾"/>
-    <w:basedOn w:val="a1"/>
-    <w:qFormat/>
-  </w:style>
-  <w:style w:type="paragraph" w:styleId="af3">
+  </w:style>
+  <w:style w:type="paragraph" w:styleId="af2">
     <w:name w:val="footer"/>
-    <w:basedOn w:val="user0"/>
+    <w:basedOn w:val="af1"/>
     <w:pPr>
       <w:jc w:val="center"/>
     </w:pPr>
   </w:style>
   <w:style w:type="paragraph" w:customStyle="1" w:styleId="100">
     <w:name w:val="書狀_證據編號10"/>
-    <w:basedOn w:val="af0"/>
+    <w:basedOn w:val="af"/>
     <w:qFormat/>
     <w:pPr>
       <w:ind w:left="1176" w:hanging="1176"/>
     </w:pPr>
   </w:style>
-  <w:style w:type="paragraph" w:customStyle="1" w:styleId="af4">
+  <w:style w:type="paragraph" w:customStyle="1" w:styleId="af3">
     <w:name w:val="書狀_被上證據編號"/>
-    <w:basedOn w:val="af0"/>
+    <w:basedOn w:val="af"/>
     <w:qFormat/>
     <w:pPr>
       <w:ind w:left="1323" w:hanging="1323"/>
@@ -2647,7 +2645,7 @@
   </w:style>
   <w:style w:type="paragraph" w:customStyle="1" w:styleId="101">
     <w:name w:val="書狀_被上證據編號10"/>
-    <w:basedOn w:val="af0"/>
+    <w:basedOn w:val="af"/>
     <w:qFormat/>
     <w:pPr>
       <w:ind w:left="1470" w:hanging="1470"/>
@@ -2664,9 +2662,9 @@
       <w:outlineLvl w:val="9"/>
     </w:pPr>
   </w:style>
-  <w:style w:type="paragraph" w:styleId="af5">
+  <w:style w:type="paragraph" w:styleId="af4">
     <w:name w:val="header"/>
-    <w:basedOn w:val="user0"/>
+    <w:basedOn w:val="af1"/>
     <w:pPr>
       <w:tabs>
         <w:tab w:val="center" w:pos="4536"/>
@@ -2674,9 +2672,9 @@
       </w:tabs>
     </w:pPr>
   </w:style>
-  <w:style w:type="paragraph" w:customStyle="1" w:styleId="af6">
+  <w:style w:type="paragraph" w:customStyle="1" w:styleId="af5">
     <w:name w:val="書狀_狀首當事人"/>
-    <w:basedOn w:val="ad"/>
+    <w:basedOn w:val="ac"/>
     <w:qFormat/>
     <w:rsid w:val="00B10778"/>
     <w:pPr>
@@ -2687,15 +2685,15 @@
       <w:jc w:val="left"/>
     </w:pPr>
   </w:style>
-  <w:style w:type="paragraph" w:styleId="af7">
+  <w:style w:type="paragraph" w:styleId="af6">
     <w:name w:val="Signature"/>
     <w:basedOn w:val="a1"/>
     <w:pPr>
       <w:suppressLineNumbers/>
     </w:pPr>
   </w:style>
-  <w:style w:type="paragraph" w:customStyle="1" w:styleId="af8">
-    <w:name w:val="已先格式設定文字"/>
+  <w:style w:type="paragraph" w:customStyle="1" w:styleId="user2">
+    <w:name w:val="已先格式設定文字 (user)"/>
     <w:basedOn w:val="a1"/>
     <w:qFormat/>
     <w:rPr>
@@ -2704,18 +2702,18 @@
       <w:szCs w:val="20"/>
     </w:rPr>
   </w:style>
-  <w:style w:type="paragraph" w:customStyle="1" w:styleId="af9">
+  <w:style w:type="paragraph" w:customStyle="1" w:styleId="af7">
     <w:name w:val="書狀_狀尾日期"/>
-    <w:basedOn w:val="ad"/>
-    <w:next w:val="ad"/>
+    <w:basedOn w:val="ac"/>
+    <w:next w:val="ac"/>
     <w:qFormat/>
     <w:rsid w:val="00E35EE7"/>
     <w:pPr>
       <w:jc w:val="distribute"/>
     </w:pPr>
   </w:style>
-  <w:style w:type="paragraph" w:customStyle="1" w:styleId="user1">
-    <w:name w:val="表格內容 (user)"/>
+  <w:style w:type="paragraph" w:customStyle="1" w:styleId="af8">
+    <w:name w:val="表格內容"/>
     <w:basedOn w:val="a1"/>
     <w:qFormat/>
     <w:pPr>
@@ -2723,9 +2721,9 @@
       <w:suppressLineNumbers/>
     </w:pPr>
   </w:style>
-  <w:style w:type="paragraph" w:customStyle="1" w:styleId="afa">
+  <w:style w:type="paragraph" w:customStyle="1" w:styleId="af9">
     <w:name w:val="爭點表_內容"/>
-    <w:basedOn w:val="ad"/>
+    <w:basedOn w:val="ac"/>
     <w:qFormat/>
     <w:pPr>
       <w:suppressLineNumbers/>
@@ -2736,9 +2734,9 @@
       <w:sz w:val="24"/>
     </w:rPr>
   </w:style>
-  <w:style w:type="paragraph" w:customStyle="1" w:styleId="afb">
+  <w:style w:type="paragraph" w:customStyle="1" w:styleId="afa">
     <w:name w:val="爭點表_清單"/>
-    <w:basedOn w:val="afa"/>
+    <w:basedOn w:val="af9"/>
     <w:qFormat/>
     <w:pPr>
       <w:tabs>
@@ -2747,9 +2745,9 @@
       <w:ind w:left="273" w:hanging="273"/>
     </w:pPr>
   </w:style>
-  <w:style w:type="paragraph" w:customStyle="1" w:styleId="afc">
+  <w:style w:type="paragraph" w:customStyle="1" w:styleId="afb">
     <w:name w:val="爭點表_標題"/>
-    <w:basedOn w:val="afa"/>
+    <w:basedOn w:val="af9"/>
     <w:qFormat/>
     <w:pPr>
       <w:spacing w:line="240" w:lineRule="auto"/>
@@ -2766,12 +2764,12 @@
     <w:unhideWhenUsed/>
     <w:qFormat/>
   </w:style>
-  <w:style w:type="numbering" w:customStyle="1" w:styleId="afd">
+  <w:style w:type="numbering" w:customStyle="1" w:styleId="afc">
     <w:name w:val="通用_多層次編號"/>
     <w:qFormat/>
   </w:style>
-  <w:style w:type="numbering" w:customStyle="1" w:styleId="afe">
-    <w:name w:val="項目符號 •"/>
+  <w:style w:type="numbering" w:customStyle="1" w:styleId="user3">
+    <w:name w:val="項目符號 • (user)"/>
     <w:qFormat/>
   </w:style>
 </w:styles>

</xml_diff>

<commit_message>
feat: sync recent local modifications from client
</commit_message>
<xml_diff>
--- a/draft-pleading/assets/pleading-tmpl.docx
+++ b/draft-pleading/assets/pleading-tmpl.docx
@@ -4,7 +4,7 @@
   <w:body>
     <w:p>
       <w:pPr>
-        <w:pStyle w:val="ad"/>
+        <w:pStyle w:val="ae"/>
         <w:numPr>
           <w:ilvl w:val="1"/>
           <w:numId w:val="3"/>
@@ -16,7 +16,7 @@
     </w:p>
     <w:p>
       <w:pPr>
-        <w:pStyle w:val="ac"/>
+        <w:pStyle w:val="ad"/>
         <w:rPr>
           <w:rFonts w:cs="細明體"/>
           <w:color w:val="000000"/>
@@ -52,7 +52,7 @@
     </w:p>
     <w:p>
       <w:pPr>
-        <w:pStyle w:val="ac"/>
+        <w:pStyle w:val="ad"/>
       </w:pPr>
       <w:proofErr w:type="gramStart"/>
       <w:r>
@@ -65,7 +65,7 @@
     </w:p>
     <w:p>
       <w:pPr>
-        <w:pStyle w:val="af5"/>
+        <w:pStyle w:val="af6"/>
       </w:pPr>
       <w:r>
         <w:t>被告</w:t>
@@ -88,7 +88,7 @@
     </w:p>
     <w:p>
       <w:pPr>
-        <w:pStyle w:val="af5"/>
+        <w:pStyle w:val="af6"/>
       </w:pPr>
       <w:r>
         <w:t>法定代理人</w:t>
@@ -100,7 +100,7 @@
     </w:p>
     <w:p>
       <w:pPr>
-        <w:pStyle w:val="af5"/>
+        <w:pStyle w:val="af6"/>
       </w:pPr>
       <w:r>
         <w:t>訴訟代理人</w:t>
@@ -129,7 +129,7 @@
     </w:p>
     <w:p>
       <w:pPr>
-        <w:pStyle w:val="af5"/>
+        <w:pStyle w:val="af6"/>
       </w:pPr>
       <w:r>
         <w:t>原告</w:t>
@@ -141,7 +141,7 @@
     </w:p>
     <w:p>
       <w:pPr>
-        <w:pStyle w:val="af5"/>
+        <w:pStyle w:val="af6"/>
       </w:pPr>
       <w:r>
         <w:t>訴訟代理人</w:t>
@@ -153,7 +153,7 @@
     </w:p>
     <w:p>
       <w:pPr>
-        <w:pStyle w:val="ac"/>
+        <w:pStyle w:val="ad"/>
       </w:pPr>
       <w:r>
         <w:rPr>
@@ -166,14 +166,14 @@
         <w:rPr>
           <w:lang w:val="zh-TW"/>
         </w:rPr>
-        <w:t>僱傭</w:t>
+        <w:t>僱</w:t>
       </w:r>
       <w:proofErr w:type="gramEnd"/>
       <w:r>
         <w:rPr>
           <w:lang w:val="zh-TW"/>
         </w:rPr>
-        <w:t>關係存在等事件，提出答辯事：</w:t>
+        <w:t>傭關係存在等事件，提出答辯事：</w:t>
       </w:r>
     </w:p>
     <w:p>
@@ -189,12 +189,12 @@
     </w:p>
     <w:p>
       <w:pPr>
-        <w:pStyle w:val="ac"/>
+        <w:pStyle w:val="ad"/>
       </w:pPr>
     </w:p>
     <w:p>
       <w:pPr>
-        <w:pStyle w:val="ac"/>
+        <w:pStyle w:val="ad"/>
       </w:pPr>
       <w:r>
         <w:t>證據或文件清單：</w:t>
@@ -202,7 +202,7 @@
     </w:p>
     <w:p>
       <w:pPr>
-        <w:pStyle w:val="af"/>
+        <w:pStyle w:val="af0"/>
       </w:pPr>
       <w:proofErr w:type="gramStart"/>
       <w:r>
@@ -228,7 +228,7 @@
     </w:p>
     <w:p>
       <w:pPr>
-        <w:pStyle w:val="af0"/>
+        <w:pStyle w:val="af1"/>
       </w:pPr>
       <w:r>
         <w:t>謹狀</w:t>
@@ -236,7 +236,7 @@
     </w:p>
     <w:p>
       <w:pPr>
-        <w:pStyle w:val="ac"/>
+        <w:pStyle w:val="ad"/>
         <w:rPr>
           <w:rFonts w:cs="細明體"/>
           <w:color w:val="000000"/>
@@ -276,7 +276,7 @@
     </w:p>
     <w:p>
       <w:pPr>
-        <w:pStyle w:val="af7"/>
+        <w:pStyle w:val="af9"/>
       </w:pPr>
       <w:r>
         <w:t>中華民國115年4月27日</w:t>
@@ -284,7 +284,7 @@
     </w:p>
     <w:p>
       <w:pPr>
-        <w:pStyle w:val="ae"/>
+        <w:pStyle w:val="af"/>
       </w:pPr>
       <w:proofErr w:type="gramStart"/>
       <w:r>
@@ -305,7 +305,7 @@
     </w:p>
     <w:p>
       <w:pPr>
-        <w:pStyle w:val="ae"/>
+        <w:pStyle w:val="af"/>
       </w:pPr>
       <w:r>
         <w:t>訴訟代理人：王小華律師</w:t>
@@ -313,7 +313,7 @@
     </w:p>
     <w:p>
       <w:pPr>
-        <w:pStyle w:val="ac"/>
+        <w:pStyle w:val="ad"/>
       </w:pPr>
       <w:r>
         <w:br w:type="page"/>
@@ -321,7 +321,7 @@
     </w:p>
     <w:p>
       <w:pPr>
-        <w:pStyle w:val="ac"/>
+        <w:pStyle w:val="ad"/>
       </w:pPr>
     </w:p>
     <w:tbl>
@@ -338,10 +338,10 @@
         <w:tblLook w:val="04A0" w:firstRow="1" w:lastRow="0" w:firstColumn="1" w:lastColumn="0" w:noHBand="0" w:noVBand="1"/>
       </w:tblPr>
       <w:tblGrid>
-        <w:gridCol w:w="1758"/>
-        <w:gridCol w:w="2439"/>
-        <w:gridCol w:w="2434"/>
+        <w:gridCol w:w="1757"/>
         <w:gridCol w:w="2440"/>
+        <w:gridCol w:w="2433"/>
+        <w:gridCol w:w="2441"/>
       </w:tblGrid>
       <w:tr>
         <w:trPr>
@@ -351,7 +351,7 @@
         </w:trPr>
         <w:tc>
           <w:tcPr>
-            <w:tcW w:w="1758" w:type="dxa"/>
+            <w:tcW w:w="1757" w:type="dxa"/>
             <w:tcBorders>
               <w:top w:val="single" w:sz="4" w:space="0" w:color="000000"/>
               <w:left w:val="single" w:sz="4" w:space="0" w:color="000000"/>
@@ -361,7 +361,7 @@
           </w:tcPr>
           <w:p>
             <w:pPr>
-              <w:pStyle w:val="afb"/>
+              <w:pStyle w:val="afc"/>
             </w:pPr>
             <w:r>
               <w:t>爭點</w:t>
@@ -370,7 +370,7 @@
         </w:tc>
         <w:tc>
           <w:tcPr>
-            <w:tcW w:w="2439" w:type="dxa"/>
+            <w:tcW w:w="2440" w:type="dxa"/>
             <w:tcBorders>
               <w:top w:val="single" w:sz="4" w:space="0" w:color="000000"/>
               <w:left w:val="single" w:sz="4" w:space="0" w:color="000000"/>
@@ -380,7 +380,7 @@
           </w:tcPr>
           <w:p>
             <w:pPr>
-              <w:pStyle w:val="afb"/>
+              <w:pStyle w:val="afc"/>
             </w:pPr>
             <w:r>
               <w:t>原因事實</w:t>
@@ -389,7 +389,7 @@
         </w:tc>
         <w:tc>
           <w:tcPr>
-            <w:tcW w:w="2434" w:type="dxa"/>
+            <w:tcW w:w="2433" w:type="dxa"/>
             <w:tcBorders>
               <w:top w:val="single" w:sz="4" w:space="0" w:color="000000"/>
               <w:left w:val="single" w:sz="4" w:space="0" w:color="000000"/>
@@ -399,7 +399,7 @@
           </w:tcPr>
           <w:p>
             <w:pPr>
-              <w:pStyle w:val="afb"/>
+              <w:pStyle w:val="afc"/>
             </w:pPr>
             <w:r>
               <w:t>法律依據</w:t>
@@ -408,7 +408,7 @@
         </w:tc>
         <w:tc>
           <w:tcPr>
-            <w:tcW w:w="2440" w:type="dxa"/>
+            <w:tcW w:w="2441" w:type="dxa"/>
             <w:tcBorders>
               <w:top w:val="single" w:sz="4" w:space="0" w:color="000000"/>
               <w:left w:val="single" w:sz="4" w:space="0" w:color="000000"/>
@@ -419,7 +419,7 @@
           </w:tcPr>
           <w:p>
             <w:pPr>
-              <w:pStyle w:val="afb"/>
+              <w:pStyle w:val="afc"/>
             </w:pPr>
             <w:r>
               <w:t>證據</w:t>
@@ -434,21 +434,7 @@
         </w:trPr>
         <w:tc>
           <w:tcPr>
-            <w:tcW w:w="1758" w:type="dxa"/>
-            <w:tcBorders>
-              <w:left w:val="single" w:sz="4" w:space="0" w:color="000000"/>
-              <w:bottom w:val="single" w:sz="4" w:space="0" w:color="000000"/>
-            </w:tcBorders>
-          </w:tcPr>
-          <w:p>
-            <w:pPr>
-              <w:pStyle w:val="af9"/>
-            </w:pPr>
-          </w:p>
-        </w:tc>
-        <w:tc>
-          <w:tcPr>
-            <w:tcW w:w="2439" w:type="dxa"/>
+            <w:tcW w:w="1757" w:type="dxa"/>
             <w:tcBorders>
               <w:left w:val="single" w:sz="4" w:space="0" w:color="000000"/>
               <w:bottom w:val="single" w:sz="4" w:space="0" w:color="000000"/>
@@ -457,6 +443,20 @@
           <w:p>
             <w:pPr>
               <w:pStyle w:val="afa"/>
+            </w:pPr>
+          </w:p>
+        </w:tc>
+        <w:tc>
+          <w:tcPr>
+            <w:tcW w:w="2440" w:type="dxa"/>
+            <w:tcBorders>
+              <w:left w:val="single" w:sz="4" w:space="0" w:color="000000"/>
+              <w:bottom w:val="single" w:sz="4" w:space="0" w:color="000000"/>
+            </w:tcBorders>
+          </w:tcPr>
+          <w:p>
+            <w:pPr>
+              <w:pStyle w:val="afb"/>
             </w:pPr>
             <w:r>
               <w:t>•</w:t>
@@ -465,21 +465,21 @@
         </w:tc>
         <w:tc>
           <w:tcPr>
-            <w:tcW w:w="2434" w:type="dxa"/>
-            <w:tcBorders>
-              <w:left w:val="single" w:sz="4" w:space="0" w:color="000000"/>
-              <w:bottom w:val="single" w:sz="4" w:space="0" w:color="000000"/>
-            </w:tcBorders>
-          </w:tcPr>
-          <w:p>
-            <w:pPr>
-              <w:pStyle w:val="af9"/>
-            </w:pPr>
-          </w:p>
-        </w:tc>
-        <w:tc>
-          <w:tcPr>
-            <w:tcW w:w="2440" w:type="dxa"/>
+            <w:tcW w:w="2433" w:type="dxa"/>
+            <w:tcBorders>
+              <w:left w:val="single" w:sz="4" w:space="0" w:color="000000"/>
+              <w:bottom w:val="single" w:sz="4" w:space="0" w:color="000000"/>
+            </w:tcBorders>
+          </w:tcPr>
+          <w:p>
+            <w:pPr>
+              <w:pStyle w:val="afa"/>
+            </w:pPr>
+          </w:p>
+        </w:tc>
+        <w:tc>
+          <w:tcPr>
+            <w:tcW w:w="2441" w:type="dxa"/>
             <w:tcBorders>
               <w:left w:val="single" w:sz="4" w:space="0" w:color="000000"/>
               <w:bottom w:val="single" w:sz="4" w:space="0" w:color="000000"/>
@@ -488,7 +488,7 @@
           </w:tcPr>
           <w:p>
             <w:pPr>
-              <w:pStyle w:val="afa"/>
+              <w:pStyle w:val="afb"/>
             </w:pPr>
           </w:p>
         </w:tc>
@@ -496,7 +496,7 @@
     </w:tbl>
     <w:p>
       <w:pPr>
-        <w:pStyle w:val="ac"/>
+        <w:pStyle w:val="ad"/>
       </w:pPr>
     </w:p>
     <w:p>
@@ -521,9 +521,9 @@
         <w:tblLook w:val="04A0" w:firstRow="1" w:lastRow="0" w:firstColumn="1" w:lastColumn="0" w:noHBand="0" w:noVBand="1"/>
       </w:tblPr>
       <w:tblGrid>
-        <w:gridCol w:w="509"/>
+        <w:gridCol w:w="508"/>
         <w:gridCol w:w="1701"/>
-        <w:gridCol w:w="1702"/>
+        <w:gridCol w:w="1703"/>
         <w:gridCol w:w="1700"/>
         <w:gridCol w:w="1758"/>
         <w:gridCol w:w="1701"/>
@@ -535,7 +535,7 @@
         </w:trPr>
         <w:tc>
           <w:tcPr>
-            <w:tcW w:w="509" w:type="dxa"/>
+            <w:tcW w:w="508" w:type="dxa"/>
             <w:tcBorders>
               <w:top w:val="single" w:sz="4" w:space="0" w:color="000000"/>
               <w:left w:val="single" w:sz="4" w:space="0" w:color="000000"/>
@@ -545,7 +545,7 @@
           </w:tcPr>
           <w:p>
             <w:pPr>
-              <w:pStyle w:val="afb"/>
+              <w:pStyle w:val="afc"/>
             </w:pPr>
             <w:r>
               <w:t>編號</w:t>
@@ -564,7 +564,7 @@
           </w:tcPr>
           <w:p>
             <w:pPr>
-              <w:pStyle w:val="afb"/>
+              <w:pStyle w:val="afc"/>
             </w:pPr>
             <w:proofErr w:type="gramStart"/>
             <w:r>
@@ -575,7 +575,7 @@
         </w:tc>
         <w:tc>
           <w:tcPr>
-            <w:tcW w:w="1702" w:type="dxa"/>
+            <w:tcW w:w="1703" w:type="dxa"/>
             <w:tcBorders>
               <w:top w:val="single" w:sz="4" w:space="0" w:color="000000"/>
               <w:left w:val="single" w:sz="4" w:space="0" w:color="000000"/>
@@ -585,7 +585,7 @@
           </w:tcPr>
           <w:p>
             <w:pPr>
-              <w:pStyle w:val="afb"/>
+              <w:pStyle w:val="afc"/>
             </w:pPr>
             <w:r>
               <w:t>調查事項</w:t>
@@ -604,7 +604,7 @@
           </w:tcPr>
           <w:p>
             <w:pPr>
-              <w:pStyle w:val="afb"/>
+              <w:pStyle w:val="afc"/>
             </w:pPr>
             <w:r>
               <w:t>調查對象</w:t>
@@ -623,7 +623,7 @@
           </w:tcPr>
           <w:p>
             <w:pPr>
-              <w:pStyle w:val="afb"/>
+              <w:pStyle w:val="afc"/>
             </w:pPr>
             <w:r>
               <w:t>對象地址</w:t>
@@ -631,7 +631,7 @@
           </w:p>
           <w:p>
             <w:pPr>
-              <w:pStyle w:val="afb"/>
+              <w:pStyle w:val="afc"/>
             </w:pPr>
             <w:r>
               <w:t>及聯絡方式</w:t>
@@ -651,7 +651,7 @@
           </w:tcPr>
           <w:p>
             <w:pPr>
-              <w:pStyle w:val="afb"/>
+              <w:pStyle w:val="afc"/>
             </w:pPr>
             <w:proofErr w:type="gramStart"/>
             <w:r>
@@ -667,16 +667,16 @@
         </w:trPr>
         <w:tc>
           <w:tcPr>
-            <w:tcW w:w="509" w:type="dxa"/>
-            <w:tcBorders>
-              <w:left w:val="single" w:sz="4" w:space="0" w:color="000000"/>
-              <w:bottom w:val="single" w:sz="4" w:space="0" w:color="000000"/>
-            </w:tcBorders>
-            <w:vAlign w:val="center"/>
-          </w:tcPr>
-          <w:p>
-            <w:pPr>
-              <w:pStyle w:val="af9"/>
+            <w:tcW w:w="508" w:type="dxa"/>
+            <w:tcBorders>
+              <w:left w:val="single" w:sz="4" w:space="0" w:color="000000"/>
+              <w:bottom w:val="single" w:sz="4" w:space="0" w:color="000000"/>
+            </w:tcBorders>
+            <w:vAlign w:val="center"/>
+          </w:tcPr>
+          <w:p>
+            <w:pPr>
+              <w:pStyle w:val="afa"/>
               <w:jc w:val="center"/>
             </w:pPr>
           </w:p>
@@ -692,13 +692,43 @@
           </w:tcPr>
           <w:p>
             <w:pPr>
+              <w:pStyle w:val="afb"/>
+            </w:pPr>
+          </w:p>
+        </w:tc>
+        <w:tc>
+          <w:tcPr>
+            <w:tcW w:w="1703" w:type="dxa"/>
+            <w:tcBorders>
+              <w:left w:val="single" w:sz="4" w:space="0" w:color="000000"/>
+              <w:bottom w:val="single" w:sz="4" w:space="0" w:color="000000"/>
+            </w:tcBorders>
+            <w:vAlign w:val="center"/>
+          </w:tcPr>
+          <w:p>
+            <w:pPr>
+              <w:pStyle w:val="afb"/>
+            </w:pPr>
+          </w:p>
+        </w:tc>
+        <w:tc>
+          <w:tcPr>
+            <w:tcW w:w="1700" w:type="dxa"/>
+            <w:tcBorders>
+              <w:left w:val="single" w:sz="4" w:space="0" w:color="000000"/>
+              <w:bottom w:val="single" w:sz="4" w:space="0" w:color="000000"/>
+            </w:tcBorders>
+            <w:vAlign w:val="center"/>
+          </w:tcPr>
+          <w:p>
+            <w:pPr>
               <w:pStyle w:val="afa"/>
             </w:pPr>
           </w:p>
         </w:tc>
         <w:tc>
           <w:tcPr>
-            <w:tcW w:w="1702" w:type="dxa"/>
+            <w:tcW w:w="1758" w:type="dxa"/>
             <w:tcBorders>
               <w:left w:val="single" w:sz="4" w:space="0" w:color="000000"/>
               <w:bottom w:val="single" w:sz="4" w:space="0" w:color="000000"/>
@@ -713,36 +743,6 @@
         </w:tc>
         <w:tc>
           <w:tcPr>
-            <w:tcW w:w="1700" w:type="dxa"/>
-            <w:tcBorders>
-              <w:left w:val="single" w:sz="4" w:space="0" w:color="000000"/>
-              <w:bottom w:val="single" w:sz="4" w:space="0" w:color="000000"/>
-            </w:tcBorders>
-            <w:vAlign w:val="center"/>
-          </w:tcPr>
-          <w:p>
-            <w:pPr>
-              <w:pStyle w:val="af9"/>
-            </w:pPr>
-          </w:p>
-        </w:tc>
-        <w:tc>
-          <w:tcPr>
-            <w:tcW w:w="1758" w:type="dxa"/>
-            <w:tcBorders>
-              <w:left w:val="single" w:sz="4" w:space="0" w:color="000000"/>
-              <w:bottom w:val="single" w:sz="4" w:space="0" w:color="000000"/>
-            </w:tcBorders>
-            <w:vAlign w:val="center"/>
-          </w:tcPr>
-          <w:p>
-            <w:pPr>
-              <w:pStyle w:val="af9"/>
-            </w:pPr>
-          </w:p>
-        </w:tc>
-        <w:tc>
-          <w:tcPr>
             <w:tcW w:w="1701" w:type="dxa"/>
             <w:tcBorders>
               <w:left w:val="single" w:sz="4" w:space="0" w:color="000000"/>
@@ -753,7 +753,7 @@
           </w:tcPr>
           <w:p>
             <w:pPr>
-              <w:pStyle w:val="afa"/>
+              <w:pStyle w:val="afb"/>
             </w:pPr>
           </w:p>
         </w:tc>
@@ -761,7 +761,7 @@
     </w:tbl>
     <w:p>
       <w:pPr>
-        <w:pStyle w:val="ac"/>
+        <w:pStyle w:val="ad"/>
       </w:pPr>
     </w:p>
     <w:tbl>
@@ -780,10 +780,10 @@
       <w:tblGrid>
         <w:gridCol w:w="506"/>
         <w:gridCol w:w="1064"/>
-        <w:gridCol w:w="1454"/>
+        <w:gridCol w:w="1453"/>
         <w:gridCol w:w="1455"/>
         <w:gridCol w:w="1455"/>
-        <w:gridCol w:w="996"/>
+        <w:gridCol w:w="997"/>
         <w:gridCol w:w="1524"/>
         <w:gridCol w:w="618"/>
       </w:tblGrid>
@@ -806,7 +806,7 @@
           </w:tcPr>
           <w:p>
             <w:pPr>
-              <w:pStyle w:val="afb"/>
+              <w:pStyle w:val="afc"/>
             </w:pPr>
             <w:r>
               <w:t>序號</w:t>
@@ -826,7 +826,7 @@
           </w:tcPr>
           <w:p>
             <w:pPr>
-              <w:pStyle w:val="afb"/>
+              <w:pStyle w:val="afc"/>
             </w:pPr>
             <w:r>
               <w:t>證據</w:t>
@@ -839,7 +839,7 @@
         </w:tc>
         <w:tc>
           <w:tcPr>
-            <w:tcW w:w="1454" w:type="dxa"/>
+            <w:tcW w:w="1453" w:type="dxa"/>
             <w:vMerge w:val="restart"/>
             <w:tcBorders>
               <w:top w:val="single" w:sz="4" w:space="0" w:color="000000"/>
@@ -850,7 +850,7 @@
           </w:tcPr>
           <w:p>
             <w:pPr>
-              <w:pStyle w:val="afb"/>
+              <w:pStyle w:val="afc"/>
             </w:pPr>
             <w:r>
               <w:t>證據名稱</w:t>
@@ -870,7 +870,7 @@
           </w:tcPr>
           <w:p>
             <w:pPr>
-              <w:pStyle w:val="afb"/>
+              <w:pStyle w:val="afc"/>
             </w:pPr>
             <w:r>
               <w:t>證據</w:t>
@@ -894,7 +894,7 @@
           </w:tcPr>
           <w:p>
             <w:pPr>
-              <w:pStyle w:val="afb"/>
+              <w:pStyle w:val="afc"/>
             </w:pPr>
             <w:proofErr w:type="gramStart"/>
             <w:r>
@@ -905,7 +905,7 @@
         </w:tc>
         <w:tc>
           <w:tcPr>
-            <w:tcW w:w="2520" w:type="dxa"/>
+            <w:tcW w:w="2521" w:type="dxa"/>
             <w:gridSpan w:val="2"/>
             <w:tcBorders>
               <w:top w:val="single" w:sz="4" w:space="0" w:color="000000"/>
@@ -916,7 +916,7 @@
           </w:tcPr>
           <w:p>
             <w:pPr>
-              <w:pStyle w:val="afb"/>
+              <w:pStyle w:val="afc"/>
             </w:pPr>
             <w:r>
               <w:t>證據附卷位置</w:t>
@@ -937,7 +937,7 @@
           </w:tcPr>
           <w:p>
             <w:pPr>
-              <w:pStyle w:val="afb"/>
+              <w:pStyle w:val="afc"/>
             </w:pPr>
             <w:r>
               <w:t>備註</w:t>
@@ -968,7 +968,7 @@
           </w:tcPr>
           <w:p>
             <w:pPr>
-              <w:pStyle w:val="af8"/>
+              <w:pStyle w:val="user1"/>
               <w:rPr>
                 <w:rFonts w:ascii="標楷體" w:eastAsia="標楷體" w:hAnsi="標楷體"/>
               </w:rPr>
@@ -987,7 +987,7 @@
           </w:tcPr>
           <w:p>
             <w:pPr>
-              <w:pStyle w:val="af8"/>
+              <w:pStyle w:val="user1"/>
               <w:rPr>
                 <w:rFonts w:ascii="標楷體" w:eastAsia="標楷體" w:hAnsi="標楷體"/>
               </w:rPr>
@@ -996,7 +996,7 @@
         </w:tc>
         <w:tc>
           <w:tcPr>
-            <w:tcW w:w="1454" w:type="dxa"/>
+            <w:tcW w:w="1453" w:type="dxa"/>
             <w:vMerge/>
             <w:tcBorders>
               <w:left w:val="single" w:sz="4" w:space="0" w:color="000000"/>
@@ -1006,7 +1006,7 @@
           </w:tcPr>
           <w:p>
             <w:pPr>
-              <w:pStyle w:val="af8"/>
+              <w:pStyle w:val="user1"/>
               <w:rPr>
                 <w:rFonts w:ascii="標楷體" w:eastAsia="標楷體" w:hAnsi="標楷體"/>
               </w:rPr>
@@ -1025,7 +1025,7 @@
           </w:tcPr>
           <w:p>
             <w:pPr>
-              <w:pStyle w:val="af8"/>
+              <w:pStyle w:val="user1"/>
               <w:rPr>
                 <w:rFonts w:ascii="標楷體" w:eastAsia="標楷體" w:hAnsi="標楷體"/>
               </w:rPr>
@@ -1044,7 +1044,7 @@
           </w:tcPr>
           <w:p>
             <w:pPr>
-              <w:pStyle w:val="af8"/>
+              <w:pStyle w:val="user1"/>
               <w:rPr>
                 <w:rFonts w:ascii="標楷體" w:eastAsia="標楷體" w:hAnsi="標楷體"/>
               </w:rPr>
@@ -1053,16 +1053,16 @@
         </w:tc>
         <w:tc>
           <w:tcPr>
-            <w:tcW w:w="996" w:type="dxa"/>
-            <w:tcBorders>
-              <w:left w:val="single" w:sz="4" w:space="0" w:color="000000"/>
-              <w:bottom w:val="single" w:sz="4" w:space="0" w:color="000000"/>
-            </w:tcBorders>
-            <w:vAlign w:val="center"/>
-          </w:tcPr>
-          <w:p>
-            <w:pPr>
-              <w:pStyle w:val="afb"/>
+            <w:tcW w:w="997" w:type="dxa"/>
+            <w:tcBorders>
+              <w:left w:val="single" w:sz="4" w:space="0" w:color="000000"/>
+              <w:bottom w:val="single" w:sz="4" w:space="0" w:color="000000"/>
+            </w:tcBorders>
+            <w:vAlign w:val="center"/>
+          </w:tcPr>
+          <w:p>
+            <w:pPr>
+              <w:pStyle w:val="afc"/>
               <w:rPr>
                 <w:sz w:val="22"/>
                 <w:szCs w:val="22"/>
@@ -1088,7 +1088,7 @@
           </w:tcPr>
           <w:p>
             <w:pPr>
-              <w:pStyle w:val="afb"/>
+              <w:pStyle w:val="afc"/>
               <w:rPr>
                 <w:sz w:val="22"/>
                 <w:szCs w:val="22"/>
@@ -1117,7 +1117,7 @@
           </w:tcPr>
           <w:p>
             <w:pPr>
-              <w:pStyle w:val="afb"/>
+              <w:pStyle w:val="afc"/>
             </w:pPr>
           </w:p>
         </w:tc>
@@ -1138,7 +1138,7 @@
           </w:tcPr>
           <w:p>
             <w:pPr>
-              <w:pStyle w:val="af8"/>
+              <w:pStyle w:val="user1"/>
               <w:jc w:val="center"/>
               <w:rPr>
                 <w:rFonts w:ascii="標楷體" w:eastAsia="標楷體" w:hAnsi="標楷體"/>
@@ -1157,7 +1157,7 @@
           </w:tcPr>
           <w:p>
             <w:pPr>
-              <w:pStyle w:val="af8"/>
+              <w:pStyle w:val="user1"/>
               <w:jc w:val="center"/>
               <w:rPr>
                 <w:rFonts w:ascii="標楷體" w:eastAsia="標楷體" w:hAnsi="標楷體"/>
@@ -1197,16 +1197,16 @@
         </w:tc>
         <w:tc>
           <w:tcPr>
-            <w:tcW w:w="1454" w:type="dxa"/>
-            <w:tcBorders>
-              <w:left w:val="single" w:sz="4" w:space="0" w:color="000000"/>
-              <w:bottom w:val="single" w:sz="4" w:space="0" w:color="000000"/>
-            </w:tcBorders>
-            <w:vAlign w:val="center"/>
-          </w:tcPr>
-          <w:p>
-            <w:pPr>
-              <w:pStyle w:val="af8"/>
+            <w:tcW w:w="1453" w:type="dxa"/>
+            <w:tcBorders>
+              <w:left w:val="single" w:sz="4" w:space="0" w:color="000000"/>
+              <w:bottom w:val="single" w:sz="4" w:space="0" w:color="000000"/>
+            </w:tcBorders>
+            <w:vAlign w:val="center"/>
+          </w:tcPr>
+          <w:p>
+            <w:pPr>
+              <w:pStyle w:val="user1"/>
               <w:rPr>
                 <w:rFonts w:ascii="標楷體" w:eastAsia="標楷體" w:hAnsi="標楷體"/>
               </w:rPr>
@@ -1224,7 +1224,7 @@
           </w:tcPr>
           <w:p>
             <w:pPr>
-              <w:pStyle w:val="af8"/>
+              <w:pStyle w:val="user1"/>
               <w:rPr>
                 <w:rFonts w:ascii="標楷體" w:eastAsia="標楷體" w:hAnsi="標楷體"/>
               </w:rPr>
@@ -1242,7 +1242,7 @@
           </w:tcPr>
           <w:p>
             <w:pPr>
-              <w:pStyle w:val="af8"/>
+              <w:pStyle w:val="user1"/>
               <w:rPr>
                 <w:rFonts w:ascii="標楷體" w:eastAsia="標楷體" w:hAnsi="標楷體"/>
               </w:rPr>
@@ -1251,16 +1251,16 @@
         </w:tc>
         <w:tc>
           <w:tcPr>
-            <w:tcW w:w="996" w:type="dxa"/>
-            <w:tcBorders>
-              <w:left w:val="single" w:sz="4" w:space="0" w:color="000000"/>
-              <w:bottom w:val="single" w:sz="4" w:space="0" w:color="000000"/>
-            </w:tcBorders>
-            <w:vAlign w:val="center"/>
-          </w:tcPr>
-          <w:p>
-            <w:pPr>
-              <w:pStyle w:val="af8"/>
+            <w:tcW w:w="997" w:type="dxa"/>
+            <w:tcBorders>
+              <w:left w:val="single" w:sz="4" w:space="0" w:color="000000"/>
+              <w:bottom w:val="single" w:sz="4" w:space="0" w:color="000000"/>
+            </w:tcBorders>
+            <w:vAlign w:val="center"/>
+          </w:tcPr>
+          <w:p>
+            <w:pPr>
+              <w:pStyle w:val="user1"/>
               <w:rPr>
                 <w:rFonts w:ascii="標楷體" w:eastAsia="標楷體" w:hAnsi="標楷體"/>
               </w:rPr>
@@ -1278,7 +1278,7 @@
           </w:tcPr>
           <w:p>
             <w:pPr>
-              <w:pStyle w:val="af8"/>
+              <w:pStyle w:val="user1"/>
               <w:rPr>
                 <w:rFonts w:ascii="標楷體" w:eastAsia="標楷體" w:hAnsi="標楷體"/>
               </w:rPr>
@@ -1297,7 +1297,7 @@
           </w:tcPr>
           <w:p>
             <w:pPr>
-              <w:pStyle w:val="af8"/>
+              <w:pStyle w:val="user1"/>
               <w:rPr>
                 <w:rFonts w:ascii="標楷體" w:eastAsia="標楷體" w:hAnsi="標楷體"/>
               </w:rPr>
@@ -1308,7 +1308,7 @@
     </w:tbl>
     <w:p>
       <w:pPr>
-        <w:pStyle w:val="ac"/>
+        <w:pStyle w:val="ad"/>
       </w:pPr>
     </w:p>
     <w:sectPr>
@@ -1348,7 +1348,7 @@
 <w:ftr xmlns:wpc="http://schemas.microsoft.com/office/word/2010/wordprocessingCanvas" xmlns:cx="http://schemas.microsoft.com/office/drawing/2014/chartex" xmlns:cx1="http://schemas.microsoft.com/office/drawing/2015/9/8/chartex" xmlns:cx2="http://schemas.microsoft.com/office/drawing/2015/10/21/chartex" xmlns:cx3="http://schemas.microsoft.com/office/drawing/2016/5/9/chartex" xmlns:cx4="http://schemas.microsoft.com/office/drawing/2016/5/10/chartex" xmlns:cx5="http://schemas.microsoft.com/office/drawing/2016/5/11/chartex" xmlns:cx6="http://schemas.microsoft.com/office/drawing/2016/5/12/chartex" xmlns:cx7="http://schemas.microsoft.com/office/drawing/2016/5/13/chartex" xmlns:cx8="http://schemas.microsoft.com/office/drawing/2016/5/14/chartex" xmlns:mc="http://schemas.openxmlformats.org/markup-compatibility/2006" xmlns:aink="http://schemas.microsoft.com/office/drawing/2016/ink" xmlns:am3d="http://schemas.microsoft.com/office/drawing/2017/model3d" xmlns:o="urn:schemas-microsoft-com:office:office" xmlns:oel="http://schemas.microsoft.com/office/2019/extlst" xmlns:r="http://schemas.openxmlformats.org/officeDocument/2006/relationships" xmlns:m="http://schemas.openxmlformats.org/officeDocument/2006/math" xmlns:v="urn:schemas-microsoft-com:vml" xmlns:wp14="http://schemas.microsoft.com/office/word/2010/wordprocessingDrawing" xmlns:wp="http://schemas.openxmlformats.org/drawingml/2006/wordprocessingDrawing" xmlns:w10="urn:schemas-microsoft-com:office:word" xmlns:w="http://schemas.openxmlformats.org/wordprocessingml/2006/main" xmlns:w14="http://schemas.microsoft.com/office/word/2010/wordml" xmlns:w15="http://schemas.microsoft.com/office/word/2012/wordml" xmlns:w16cex="http://schemas.microsoft.com/office/word/2018/wordml/cex" xmlns:w16cid="http://schemas.microsoft.com/office/word/2016/wordml/cid" xmlns:w16="http://schemas.microsoft.com/office/word/2018/wordml" xmlns:w16sdtdh="http://schemas.microsoft.com/office/word/2020/wordml/sdtdatahash" xmlns:w16se="http://schemas.microsoft.com/office/word/2015/wordml/symex" xmlns:wpg="http://schemas.microsoft.com/office/word/2010/wordprocessingGroup" xmlns:wpi="http://schemas.microsoft.com/office/word/2010/wordprocessingInk" xmlns:wne="http://schemas.microsoft.com/office/word/2006/wordml" xmlns:wps="http://schemas.microsoft.com/office/word/2010/wordprocessingShape" mc:Ignorable="w14 w15 w16se w16cid w16 w16cex w16sdtdh wp14">
   <w:p>
     <w:pPr>
-      <w:pStyle w:val="af2"/>
+      <w:pStyle w:val="af3"/>
     </w:pPr>
   </w:p>
   <w:p/>
@@ -1359,7 +1359,7 @@
 <w:ftr xmlns:wpc="http://schemas.microsoft.com/office/word/2010/wordprocessingCanvas" xmlns:cx="http://schemas.microsoft.com/office/drawing/2014/chartex" xmlns:cx1="http://schemas.microsoft.com/office/drawing/2015/9/8/chartex" xmlns:cx2="http://schemas.microsoft.com/office/drawing/2015/10/21/chartex" xmlns:cx3="http://schemas.microsoft.com/office/drawing/2016/5/9/chartex" xmlns:cx4="http://schemas.microsoft.com/office/drawing/2016/5/10/chartex" xmlns:cx5="http://schemas.microsoft.com/office/drawing/2016/5/11/chartex" xmlns:cx6="http://schemas.microsoft.com/office/drawing/2016/5/12/chartex" xmlns:cx7="http://schemas.microsoft.com/office/drawing/2016/5/13/chartex" xmlns:cx8="http://schemas.microsoft.com/office/drawing/2016/5/14/chartex" xmlns:mc="http://schemas.openxmlformats.org/markup-compatibility/2006" xmlns:aink="http://schemas.microsoft.com/office/drawing/2016/ink" xmlns:am3d="http://schemas.microsoft.com/office/drawing/2017/model3d" xmlns:o="urn:schemas-microsoft-com:office:office" xmlns:oel="http://schemas.microsoft.com/office/2019/extlst" xmlns:r="http://schemas.openxmlformats.org/officeDocument/2006/relationships" xmlns:m="http://schemas.openxmlformats.org/officeDocument/2006/math" xmlns:v="urn:schemas-microsoft-com:vml" xmlns:wp14="http://schemas.microsoft.com/office/word/2010/wordprocessingDrawing" xmlns:wp="http://schemas.openxmlformats.org/drawingml/2006/wordprocessingDrawing" xmlns:w10="urn:schemas-microsoft-com:office:word" xmlns:w="http://schemas.openxmlformats.org/wordprocessingml/2006/main" xmlns:w14="http://schemas.microsoft.com/office/word/2010/wordml" xmlns:w15="http://schemas.microsoft.com/office/word/2012/wordml" xmlns:w16cex="http://schemas.microsoft.com/office/word/2018/wordml/cex" xmlns:w16cid="http://schemas.microsoft.com/office/word/2016/wordml/cid" xmlns:w16="http://schemas.microsoft.com/office/word/2018/wordml" xmlns:w16sdtdh="http://schemas.microsoft.com/office/word/2020/wordml/sdtdatahash" xmlns:w16se="http://schemas.microsoft.com/office/word/2015/wordml/symex" xmlns:wpg="http://schemas.microsoft.com/office/word/2010/wordprocessingGroup" xmlns:wpi="http://schemas.microsoft.com/office/word/2010/wordprocessingInk" xmlns:wne="http://schemas.microsoft.com/office/word/2006/wordml" xmlns:wps="http://schemas.microsoft.com/office/word/2010/wordprocessingShape" mc:Ignorable="w14 w15 w16se w16cid w16 w16cex w16sdtdh wp14">
   <w:p>
     <w:pPr>
-      <w:pStyle w:val="af2"/>
+      <w:pStyle w:val="af3"/>
     </w:pPr>
     <w:r>
       <w:fldChar w:fldCharType="begin"/>
@@ -1371,7 +1371,7 @@
       <w:fldChar w:fldCharType="separate"/>
     </w:r>
     <w:r>
-      <w:t>1</w:t>
+      <w:t>2</w:t>
     </w:r>
     <w:r>
       <w:fldChar w:fldCharType="end"/>
@@ -1384,7 +1384,7 @@
 <w:ftr xmlns:wpc="http://schemas.microsoft.com/office/word/2010/wordprocessingCanvas" xmlns:cx="http://schemas.microsoft.com/office/drawing/2014/chartex" xmlns:cx1="http://schemas.microsoft.com/office/drawing/2015/9/8/chartex" xmlns:cx2="http://schemas.microsoft.com/office/drawing/2015/10/21/chartex" xmlns:cx3="http://schemas.microsoft.com/office/drawing/2016/5/9/chartex" xmlns:cx4="http://schemas.microsoft.com/office/drawing/2016/5/10/chartex" xmlns:cx5="http://schemas.microsoft.com/office/drawing/2016/5/11/chartex" xmlns:cx6="http://schemas.microsoft.com/office/drawing/2016/5/12/chartex" xmlns:cx7="http://schemas.microsoft.com/office/drawing/2016/5/13/chartex" xmlns:cx8="http://schemas.microsoft.com/office/drawing/2016/5/14/chartex" xmlns:mc="http://schemas.openxmlformats.org/markup-compatibility/2006" xmlns:aink="http://schemas.microsoft.com/office/drawing/2016/ink" xmlns:am3d="http://schemas.microsoft.com/office/drawing/2017/model3d" xmlns:o="urn:schemas-microsoft-com:office:office" xmlns:oel="http://schemas.microsoft.com/office/2019/extlst" xmlns:r="http://schemas.openxmlformats.org/officeDocument/2006/relationships" xmlns:m="http://schemas.openxmlformats.org/officeDocument/2006/math" xmlns:v="urn:schemas-microsoft-com:vml" xmlns:wp14="http://schemas.microsoft.com/office/word/2010/wordprocessingDrawing" xmlns:wp="http://schemas.openxmlformats.org/drawingml/2006/wordprocessingDrawing" xmlns:w10="urn:schemas-microsoft-com:office:word" xmlns:w="http://schemas.openxmlformats.org/wordprocessingml/2006/main" xmlns:w14="http://schemas.microsoft.com/office/word/2010/wordml" xmlns:w15="http://schemas.microsoft.com/office/word/2012/wordml" xmlns:w16cex="http://schemas.microsoft.com/office/word/2018/wordml/cex" xmlns:w16cid="http://schemas.microsoft.com/office/word/2016/wordml/cid" xmlns:w16="http://schemas.microsoft.com/office/word/2018/wordml" xmlns:w16sdtdh="http://schemas.microsoft.com/office/word/2020/wordml/sdtdatahash" xmlns:w16se="http://schemas.microsoft.com/office/word/2015/wordml/symex" xmlns:wpg="http://schemas.microsoft.com/office/word/2010/wordprocessingGroup" xmlns:wpi="http://schemas.microsoft.com/office/word/2010/wordprocessingInk" xmlns:wne="http://schemas.microsoft.com/office/word/2006/wordml" xmlns:wps="http://schemas.microsoft.com/office/word/2010/wordprocessingShape" mc:Ignorable="w14 w15 w16se w16cid w16 w16cex w16sdtdh wp14">
   <w:p>
     <w:pPr>
-      <w:pStyle w:val="af2"/>
+      <w:pStyle w:val="af3"/>
     </w:pPr>
     <w:r>
       <w:fldChar w:fldCharType="begin"/>
@@ -1396,7 +1396,7 @@
       <w:fldChar w:fldCharType="separate"/>
     </w:r>
     <w:r>
-      <w:t>1</w:t>
+      <w:t>2</w:t>
     </w:r>
     <w:r>
       <w:fldChar w:fldCharType="end"/>
@@ -1427,9 +1427,150 @@
 <file path=word/numbering.xml><?xml version="1.0" encoding="utf-8"?>
 <w:numbering xmlns:wpc="http://schemas.microsoft.com/office/word/2010/wordprocessingCanvas" xmlns:cx="http://schemas.microsoft.com/office/drawing/2014/chartex" xmlns:cx1="http://schemas.microsoft.com/office/drawing/2015/9/8/chartex" xmlns:cx2="http://schemas.microsoft.com/office/drawing/2015/10/21/chartex" xmlns:cx3="http://schemas.microsoft.com/office/drawing/2016/5/9/chartex" xmlns:cx4="http://schemas.microsoft.com/office/drawing/2016/5/10/chartex" xmlns:cx5="http://schemas.microsoft.com/office/drawing/2016/5/11/chartex" xmlns:cx6="http://schemas.microsoft.com/office/drawing/2016/5/12/chartex" xmlns:cx7="http://schemas.microsoft.com/office/drawing/2016/5/13/chartex" xmlns:cx8="http://schemas.microsoft.com/office/drawing/2016/5/14/chartex" xmlns:mc="http://schemas.openxmlformats.org/markup-compatibility/2006" xmlns:aink="http://schemas.microsoft.com/office/drawing/2016/ink" xmlns:am3d="http://schemas.microsoft.com/office/drawing/2017/model3d" xmlns:o="urn:schemas-microsoft-com:office:office" xmlns:oel="http://schemas.microsoft.com/office/2019/extlst" xmlns:r="http://schemas.openxmlformats.org/officeDocument/2006/relationships" xmlns:m="http://schemas.openxmlformats.org/officeDocument/2006/math" xmlns:v="urn:schemas-microsoft-com:vml" xmlns:wp14="http://schemas.microsoft.com/office/word/2010/wordprocessingDrawing" xmlns:wp="http://schemas.openxmlformats.org/drawingml/2006/wordprocessingDrawing" xmlns:w10="urn:schemas-microsoft-com:office:word" xmlns:w="http://schemas.openxmlformats.org/wordprocessingml/2006/main" xmlns:w14="http://schemas.microsoft.com/office/word/2010/wordml" xmlns:w15="http://schemas.microsoft.com/office/word/2012/wordml" xmlns:w16cex="http://schemas.microsoft.com/office/word/2018/wordml/cex" xmlns:w16cid="http://schemas.microsoft.com/office/word/2016/wordml/cid" xmlns:w16="http://schemas.microsoft.com/office/word/2018/wordml" xmlns:w16sdtdh="http://schemas.microsoft.com/office/word/2020/wordml/sdtdatahash" xmlns:w16se="http://schemas.microsoft.com/office/word/2015/wordml/symex" xmlns:wpg="http://schemas.microsoft.com/office/word/2010/wordprocessingGroup" xmlns:wpi="http://schemas.microsoft.com/office/word/2010/wordprocessingInk" xmlns:wne="http://schemas.microsoft.com/office/word/2006/wordml" xmlns:wps="http://schemas.microsoft.com/office/word/2010/wordprocessingShape" mc:Ignorable="w14 w15 w16se w16cid w16 w16cex w16sdtdh wp14">
   <w:abstractNum w:abstractNumId="0" w15:restartNumberingAfterBreak="0">
-    <w:nsid w:val="2298607D"/>
+    <w:nsid w:val="149716A2"/>
     <w:multiLevelType w:val="multilevel"/>
-    <w:tmpl w:val="A8B264B6"/>
+    <w:tmpl w:val="0DA25DF2"/>
+    <w:lvl w:ilvl="0">
+      <w:start w:val="1"/>
+      <w:numFmt w:val="bullet"/>
+      <w:lvlText w:val=""/>
+      <w:lvlJc w:val="left"/>
+      <w:pPr>
+        <w:tabs>
+          <w:tab w:val="num" w:pos="227"/>
+        </w:tabs>
+        <w:ind w:left="227" w:hanging="227"/>
+      </w:pPr>
+      <w:rPr>
+        <w:rFonts w:ascii="Symbol" w:hAnsi="Symbol" w:cs="Symbol" w:hint="default"/>
+      </w:rPr>
+    </w:lvl>
+    <w:lvl w:ilvl="1">
+      <w:start w:val="1"/>
+      <w:numFmt w:val="bullet"/>
+      <w:lvlText w:val=""/>
+      <w:lvlJc w:val="left"/>
+      <w:pPr>
+        <w:tabs>
+          <w:tab w:val="num" w:pos="454"/>
+        </w:tabs>
+        <w:ind w:left="454" w:hanging="227"/>
+      </w:pPr>
+      <w:rPr>
+        <w:rFonts w:ascii="Symbol" w:hAnsi="Symbol" w:cs="Symbol" w:hint="default"/>
+      </w:rPr>
+    </w:lvl>
+    <w:lvl w:ilvl="2">
+      <w:start w:val="1"/>
+      <w:numFmt w:val="bullet"/>
+      <w:lvlText w:val=""/>
+      <w:lvlJc w:val="left"/>
+      <w:pPr>
+        <w:tabs>
+          <w:tab w:val="num" w:pos="680"/>
+        </w:tabs>
+        <w:ind w:left="680" w:hanging="227"/>
+      </w:pPr>
+      <w:rPr>
+        <w:rFonts w:ascii="Symbol" w:hAnsi="Symbol" w:cs="Symbol" w:hint="default"/>
+      </w:rPr>
+    </w:lvl>
+    <w:lvl w:ilvl="3">
+      <w:start w:val="1"/>
+      <w:numFmt w:val="bullet"/>
+      <w:pStyle w:val="a"/>
+      <w:lvlText w:val=""/>
+      <w:lvlJc w:val="left"/>
+      <w:pPr>
+        <w:tabs>
+          <w:tab w:val="num" w:pos="907"/>
+        </w:tabs>
+        <w:ind w:left="907" w:hanging="227"/>
+      </w:pPr>
+      <w:rPr>
+        <w:rFonts w:ascii="Symbol" w:hAnsi="Symbol" w:cs="Symbol" w:hint="default"/>
+      </w:rPr>
+    </w:lvl>
+    <w:lvl w:ilvl="4">
+      <w:start w:val="1"/>
+      <w:numFmt w:val="bullet"/>
+      <w:lvlText w:val=""/>
+      <w:lvlJc w:val="left"/>
+      <w:pPr>
+        <w:tabs>
+          <w:tab w:val="num" w:pos="1134"/>
+        </w:tabs>
+        <w:ind w:left="1134" w:hanging="227"/>
+      </w:pPr>
+      <w:rPr>
+        <w:rFonts w:ascii="Symbol" w:hAnsi="Symbol" w:cs="Symbol" w:hint="default"/>
+      </w:rPr>
+    </w:lvl>
+    <w:lvl w:ilvl="5">
+      <w:start w:val="1"/>
+      <w:numFmt w:val="bullet"/>
+      <w:lvlText w:val=""/>
+      <w:lvlJc w:val="left"/>
+      <w:pPr>
+        <w:tabs>
+          <w:tab w:val="num" w:pos="1361"/>
+        </w:tabs>
+        <w:ind w:left="1361" w:hanging="227"/>
+      </w:pPr>
+      <w:rPr>
+        <w:rFonts w:ascii="Symbol" w:hAnsi="Symbol" w:cs="Symbol" w:hint="default"/>
+      </w:rPr>
+    </w:lvl>
+    <w:lvl w:ilvl="6">
+      <w:start w:val="1"/>
+      <w:numFmt w:val="bullet"/>
+      <w:lvlText w:val=""/>
+      <w:lvlJc w:val="left"/>
+      <w:pPr>
+        <w:tabs>
+          <w:tab w:val="num" w:pos="1587"/>
+        </w:tabs>
+        <w:ind w:left="1587" w:hanging="227"/>
+      </w:pPr>
+      <w:rPr>
+        <w:rFonts w:ascii="Symbol" w:hAnsi="Symbol" w:cs="Symbol" w:hint="default"/>
+      </w:rPr>
+    </w:lvl>
+    <w:lvl w:ilvl="7">
+      <w:start w:val="1"/>
+      <w:numFmt w:val="bullet"/>
+      <w:lvlText w:val=""/>
+      <w:lvlJc w:val="left"/>
+      <w:pPr>
+        <w:tabs>
+          <w:tab w:val="num" w:pos="1814"/>
+        </w:tabs>
+        <w:ind w:left="1814" w:hanging="227"/>
+      </w:pPr>
+      <w:rPr>
+        <w:rFonts w:ascii="Symbol" w:hAnsi="Symbol" w:cs="Symbol" w:hint="default"/>
+      </w:rPr>
+    </w:lvl>
+    <w:lvl w:ilvl="8">
+      <w:start w:val="1"/>
+      <w:numFmt w:val="bullet"/>
+      <w:lvlText w:val=""/>
+      <w:lvlJc w:val="left"/>
+      <w:pPr>
+        <w:tabs>
+          <w:tab w:val="num" w:pos="2041"/>
+        </w:tabs>
+        <w:ind w:left="2041" w:hanging="227"/>
+      </w:pPr>
+      <w:rPr>
+        <w:rFonts w:ascii="Symbol" w:hAnsi="Symbol" w:cs="Symbol" w:hint="default"/>
+      </w:rPr>
+    </w:lvl>
+  </w:abstractNum>
+  <w:abstractNum w:abstractNumId="1" w15:restartNumberingAfterBreak="0">
+    <w:nsid w:val="346661F2"/>
+    <w:multiLevelType w:val="multilevel"/>
+    <w:tmpl w:val="BA7E10CE"/>
     <w:lvl w:ilvl="0">
       <w:start w:val="1"/>
       <w:numFmt w:val="none"/>
@@ -1548,10 +1689,10 @@
       </w:pPr>
     </w:lvl>
   </w:abstractNum>
-  <w:abstractNum w:abstractNumId="1" w15:restartNumberingAfterBreak="0">
-    <w:nsid w:val="2A687FD5"/>
+  <w:abstractNum w:abstractNumId="2" w15:restartNumberingAfterBreak="0">
+    <w:nsid w:val="3D0F3AA9"/>
     <w:multiLevelType w:val="multilevel"/>
-    <w:tmpl w:val="7B725DFA"/>
+    <w:tmpl w:val="0442C15C"/>
     <w:lvl w:ilvl="0">
       <w:start w:val="1"/>
       <w:numFmt w:val="taiwaneseCountingThousand"/>
@@ -1619,7 +1760,7 @@
     <w:lvl w:ilvl="4">
       <w:start w:val="1"/>
       <w:numFmt w:val="ideographTraditional"/>
-      <w:pStyle w:val="a"/>
+      <w:pStyle w:val="a0"/>
       <w:lvlText w:val="%5、"/>
       <w:lvlJc w:val="left"/>
       <w:pPr>
@@ -1693,10 +1834,10 @@
       </w:rPr>
     </w:lvl>
   </w:abstractNum>
-  <w:abstractNum w:abstractNumId="2" w15:restartNumberingAfterBreak="0">
-    <w:nsid w:val="3D5A5E64"/>
+  <w:abstractNum w:abstractNumId="3" w15:restartNumberingAfterBreak="0">
+    <w:nsid w:val="40C62389"/>
     <w:multiLevelType w:val="multilevel"/>
-    <w:tmpl w:val="F75402E8"/>
+    <w:tmpl w:val="E2928042"/>
     <w:lvl w:ilvl="0">
       <w:start w:val="1"/>
       <w:numFmt w:val="none"/>
@@ -1815,158 +1956,17 @@
       </w:pPr>
     </w:lvl>
   </w:abstractNum>
-  <w:abstractNum w:abstractNumId="3" w15:restartNumberingAfterBreak="0">
-    <w:nsid w:val="4B7D3CE2"/>
-    <w:multiLevelType w:val="multilevel"/>
-    <w:tmpl w:val="D7D0F948"/>
-    <w:lvl w:ilvl="0">
-      <w:start w:val="1"/>
-      <w:numFmt w:val="bullet"/>
-      <w:lvlText w:val=""/>
-      <w:lvlJc w:val="left"/>
-      <w:pPr>
-        <w:tabs>
-          <w:tab w:val="num" w:pos="227"/>
-        </w:tabs>
-        <w:ind w:left="227" w:hanging="227"/>
-      </w:pPr>
-      <w:rPr>
-        <w:rFonts w:ascii="Symbol" w:hAnsi="Symbol" w:cs="Symbol" w:hint="default"/>
-      </w:rPr>
-    </w:lvl>
-    <w:lvl w:ilvl="1">
-      <w:start w:val="1"/>
-      <w:numFmt w:val="bullet"/>
-      <w:lvlText w:val=""/>
-      <w:lvlJc w:val="left"/>
-      <w:pPr>
-        <w:tabs>
-          <w:tab w:val="num" w:pos="454"/>
-        </w:tabs>
-        <w:ind w:left="454" w:hanging="227"/>
-      </w:pPr>
-      <w:rPr>
-        <w:rFonts w:ascii="Symbol" w:hAnsi="Symbol" w:cs="Symbol" w:hint="default"/>
-      </w:rPr>
-    </w:lvl>
-    <w:lvl w:ilvl="2">
-      <w:start w:val="1"/>
-      <w:numFmt w:val="bullet"/>
-      <w:lvlText w:val=""/>
-      <w:lvlJc w:val="left"/>
-      <w:pPr>
-        <w:tabs>
-          <w:tab w:val="num" w:pos="680"/>
-        </w:tabs>
-        <w:ind w:left="680" w:hanging="227"/>
-      </w:pPr>
-      <w:rPr>
-        <w:rFonts w:ascii="Symbol" w:hAnsi="Symbol" w:cs="Symbol" w:hint="default"/>
-      </w:rPr>
-    </w:lvl>
-    <w:lvl w:ilvl="3">
-      <w:start w:val="1"/>
-      <w:numFmt w:val="bullet"/>
-      <w:pStyle w:val="a0"/>
-      <w:lvlText w:val=""/>
-      <w:lvlJc w:val="left"/>
-      <w:pPr>
-        <w:tabs>
-          <w:tab w:val="num" w:pos="907"/>
-        </w:tabs>
-        <w:ind w:left="907" w:hanging="227"/>
-      </w:pPr>
-      <w:rPr>
-        <w:rFonts w:ascii="Symbol" w:hAnsi="Symbol" w:cs="Symbol" w:hint="default"/>
-      </w:rPr>
-    </w:lvl>
-    <w:lvl w:ilvl="4">
-      <w:start w:val="1"/>
-      <w:numFmt w:val="bullet"/>
-      <w:lvlText w:val=""/>
-      <w:lvlJc w:val="left"/>
-      <w:pPr>
-        <w:tabs>
-          <w:tab w:val="num" w:pos="1134"/>
-        </w:tabs>
-        <w:ind w:left="1134" w:hanging="227"/>
-      </w:pPr>
-      <w:rPr>
-        <w:rFonts w:ascii="Symbol" w:hAnsi="Symbol" w:cs="Symbol" w:hint="default"/>
-      </w:rPr>
-    </w:lvl>
-    <w:lvl w:ilvl="5">
-      <w:start w:val="1"/>
-      <w:numFmt w:val="bullet"/>
-      <w:lvlText w:val=""/>
-      <w:lvlJc w:val="left"/>
-      <w:pPr>
-        <w:tabs>
-          <w:tab w:val="num" w:pos="1361"/>
-        </w:tabs>
-        <w:ind w:left="1361" w:hanging="227"/>
-      </w:pPr>
-      <w:rPr>
-        <w:rFonts w:ascii="Symbol" w:hAnsi="Symbol" w:cs="Symbol" w:hint="default"/>
-      </w:rPr>
-    </w:lvl>
-    <w:lvl w:ilvl="6">
-      <w:start w:val="1"/>
-      <w:numFmt w:val="bullet"/>
-      <w:lvlText w:val=""/>
-      <w:lvlJc w:val="left"/>
-      <w:pPr>
-        <w:tabs>
-          <w:tab w:val="num" w:pos="1587"/>
-        </w:tabs>
-        <w:ind w:left="1587" w:hanging="227"/>
-      </w:pPr>
-      <w:rPr>
-        <w:rFonts w:ascii="Symbol" w:hAnsi="Symbol" w:cs="Symbol" w:hint="default"/>
-      </w:rPr>
-    </w:lvl>
-    <w:lvl w:ilvl="7">
-      <w:start w:val="1"/>
-      <w:numFmt w:val="bullet"/>
-      <w:lvlText w:val=""/>
-      <w:lvlJc w:val="left"/>
-      <w:pPr>
-        <w:tabs>
-          <w:tab w:val="num" w:pos="1814"/>
-        </w:tabs>
-        <w:ind w:left="1814" w:hanging="227"/>
-      </w:pPr>
-      <w:rPr>
-        <w:rFonts w:ascii="Symbol" w:hAnsi="Symbol" w:cs="Symbol" w:hint="default"/>
-      </w:rPr>
-    </w:lvl>
-    <w:lvl w:ilvl="8">
-      <w:start w:val="1"/>
-      <w:numFmt w:val="bullet"/>
-      <w:lvlText w:val=""/>
-      <w:lvlJc w:val="left"/>
-      <w:pPr>
-        <w:tabs>
-          <w:tab w:val="num" w:pos="2041"/>
-        </w:tabs>
-        <w:ind w:left="2041" w:hanging="227"/>
-      </w:pPr>
-      <w:rPr>
-        <w:rFonts w:ascii="Symbol" w:hAnsi="Symbol" w:cs="Symbol" w:hint="default"/>
-      </w:rPr>
-    </w:lvl>
-  </w:abstractNum>
-  <w:num w:numId="1" w16cid:durableId="1571192473">
-    <w:abstractNumId w:val="1"/>
+  <w:num w:numId="1" w16cid:durableId="126746799">
+    <w:abstractNumId w:val="2"/>
   </w:num>
-  <w:num w:numId="2" w16cid:durableId="617569400">
+  <w:num w:numId="2" w16cid:durableId="1726444623">
+    <w:abstractNumId w:val="0"/>
+  </w:num>
+  <w:num w:numId="3" w16cid:durableId="127943344">
     <w:abstractNumId w:val="3"/>
   </w:num>
-  <w:num w:numId="3" w16cid:durableId="1613898415">
-    <w:abstractNumId w:val="2"/>
-  </w:num>
-  <w:num w:numId="4" w16cid:durableId="1140223684">
-    <w:abstractNumId w:val="0"/>
+  <w:num w:numId="4" w16cid:durableId="1106731107">
+    <w:abstractNumId w:val="1"/>
   </w:num>
 </w:numbering>
 </file>
@@ -2402,11 +2402,11 @@
     <w:semiHidden/>
     <w:unhideWhenUsed/>
   </w:style>
-  <w:style w:type="character" w:customStyle="1" w:styleId="user">
-    <w:name w:val="編號字元 (user)"/>
-    <w:qFormat/>
-  </w:style>
-  <w:style w:type="character" w:styleId="a5">
+  <w:style w:type="character" w:customStyle="1" w:styleId="a5">
+    <w:name w:val="編號字元"/>
+    <w:qFormat/>
+  </w:style>
+  <w:style w:type="character" w:styleId="a6">
     <w:name w:val="line number"/>
     <w:rPr>
       <w:rFonts w:eastAsia="標楷體"/>
@@ -2414,16 +2414,16 @@
       <w:sz w:val="20"/>
     </w:rPr>
   </w:style>
-  <w:style w:type="character" w:styleId="a6">
+  <w:style w:type="character" w:styleId="a7">
     <w:name w:val="page number"/>
     <w:rPr>
       <w:rFonts w:eastAsia="標楷體"/>
     </w:rPr>
   </w:style>
-  <w:style w:type="paragraph" w:styleId="a7">
+  <w:style w:type="paragraph" w:styleId="a8">
     <w:name w:val="Title"/>
     <w:basedOn w:val="a1"/>
-    <w:next w:val="a8"/>
+    <w:next w:val="a9"/>
     <w:uiPriority w:val="10"/>
     <w:qFormat/>
     <w:pPr>
@@ -2436,18 +2436,18 @@
       <w:szCs w:val="28"/>
     </w:rPr>
   </w:style>
-  <w:style w:type="paragraph" w:styleId="a8">
+  <w:style w:type="paragraph" w:styleId="a9">
     <w:name w:val="Body Text"/>
     <w:basedOn w:val="a1"/>
     <w:pPr>
       <w:spacing w:after="140" w:line="276" w:lineRule="auto"/>
     </w:pPr>
   </w:style>
-  <w:style w:type="paragraph" w:styleId="a9">
+  <w:style w:type="paragraph" w:styleId="aa">
     <w:name w:val="List"/>
-    <w:basedOn w:val="a8"/>
-  </w:style>
-  <w:style w:type="paragraph" w:styleId="aa">
+    <w:basedOn w:val="a9"/>
+  </w:style>
+  <w:style w:type="paragraph" w:styleId="ab">
     <w:name w:val="caption"/>
     <w:basedOn w:val="a1"/>
     <w:qFormat/>
@@ -2460,7 +2460,7 @@
       <w:iCs/>
     </w:rPr>
   </w:style>
-  <w:style w:type="paragraph" w:customStyle="1" w:styleId="ab">
+  <w:style w:type="paragraph" w:customStyle="1" w:styleId="ac">
     <w:name w:val="索引"/>
     <w:basedOn w:val="a1"/>
     <w:qFormat/>
@@ -2468,7 +2468,7 @@
       <w:suppressLineNumbers/>
     </w:pPr>
   </w:style>
-  <w:style w:type="paragraph" w:customStyle="1" w:styleId="user0">
+  <w:style w:type="paragraph" w:customStyle="1" w:styleId="user">
     <w:name w:val="索引 (user)"/>
     <w:basedOn w:val="a1"/>
     <w:qFormat/>
@@ -2479,7 +2479,7 @@
   <w:style w:type="paragraph" w:customStyle="1" w:styleId="10">
     <w:name w:val="標題1"/>
     <w:basedOn w:val="a1"/>
-    <w:next w:val="a8"/>
+    <w:next w:val="a9"/>
     <w:qFormat/>
     <w:pPr>
       <w:keepNext/>
@@ -2491,7 +2491,7 @@
       <w:szCs w:val="28"/>
     </w:rPr>
   </w:style>
-  <w:style w:type="paragraph" w:customStyle="1" w:styleId="a">
+  <w:style w:type="paragraph" w:customStyle="1" w:styleId="a0">
     <w:name w:val="通用多層清單"/>
     <w:qFormat/>
     <w:pPr>
@@ -2509,7 +2509,7 @@
       <w:sz w:val="28"/>
     </w:rPr>
   </w:style>
-  <w:style w:type="paragraph" w:customStyle="1" w:styleId="ac">
+  <w:style w:type="paragraph" w:customStyle="1" w:styleId="ad">
     <w:name w:val="書狀_預設"/>
     <w:qFormat/>
     <w:pPr>
@@ -2524,7 +2524,7 @@
   </w:style>
   <w:style w:type="paragraph" w:customStyle="1" w:styleId="1">
     <w:name w:val="通用_層級1"/>
-    <w:basedOn w:val="a"/>
+    <w:basedOn w:val="a0"/>
     <w:qFormat/>
     <w:pPr>
       <w:numPr>
@@ -2534,7 +2534,7 @@
   </w:style>
   <w:style w:type="paragraph" w:customStyle="1" w:styleId="2">
     <w:name w:val="通用_層級2"/>
-    <w:basedOn w:val="a"/>
+    <w:basedOn w:val="a0"/>
     <w:qFormat/>
     <w:pPr>
       <w:numPr>
@@ -2545,7 +2545,7 @@
   </w:style>
   <w:style w:type="paragraph" w:customStyle="1" w:styleId="3">
     <w:name w:val="通用_層級3"/>
-    <w:basedOn w:val="a"/>
+    <w:basedOn w:val="a0"/>
     <w:qFormat/>
     <w:pPr>
       <w:numPr>
@@ -2557,9 +2557,9 @@
       <w:szCs w:val="28"/>
     </w:rPr>
   </w:style>
-  <w:style w:type="paragraph" w:customStyle="1" w:styleId="ad">
+  <w:style w:type="paragraph" w:customStyle="1" w:styleId="ae">
     <w:name w:val="書狀_標題"/>
-    <w:basedOn w:val="ac"/>
+    <w:basedOn w:val="ad"/>
     <w:qFormat/>
     <w:pPr>
       <w:spacing w:line="240" w:lineRule="auto"/>
@@ -2569,9 +2569,9 @@
       <w:sz w:val="40"/>
     </w:rPr>
   </w:style>
-  <w:style w:type="paragraph" w:customStyle="1" w:styleId="a0">
+  <w:style w:type="paragraph" w:customStyle="1" w:styleId="a">
     <w:name w:val="書狀_清單"/>
-    <w:basedOn w:val="ac"/>
+    <w:basedOn w:val="ad"/>
     <w:qFormat/>
     <w:pPr>
       <w:numPr>
@@ -2580,25 +2580,25 @@
       </w:numPr>
     </w:pPr>
   </w:style>
-  <w:style w:type="paragraph" w:customStyle="1" w:styleId="ae">
+  <w:style w:type="paragraph" w:customStyle="1" w:styleId="af">
     <w:name w:val="書狀_簽章"/>
-    <w:basedOn w:val="ac"/>
+    <w:basedOn w:val="ad"/>
     <w:qFormat/>
     <w:pPr>
       <w:ind w:left="3402"/>
     </w:pPr>
   </w:style>
-  <w:style w:type="paragraph" w:customStyle="1" w:styleId="af">
+  <w:style w:type="paragraph" w:customStyle="1" w:styleId="af0">
     <w:name w:val="書狀_證據編號"/>
-    <w:basedOn w:val="ac"/>
+    <w:basedOn w:val="ad"/>
     <w:qFormat/>
     <w:pPr>
       <w:ind w:left="1050" w:hanging="1050"/>
     </w:pPr>
   </w:style>
-  <w:style w:type="paragraph" w:customStyle="1" w:styleId="af0">
+  <w:style w:type="paragraph" w:customStyle="1" w:styleId="af1">
     <w:name w:val="書狀_謹狀"/>
-    <w:basedOn w:val="ac"/>
+    <w:basedOn w:val="ad"/>
     <w:qFormat/>
     <w:pPr>
       <w:ind w:left="567"/>
@@ -2607,37 +2607,37 @@
       <w:spacing w:val="560"/>
     </w:rPr>
   </w:style>
-  <w:style w:type="paragraph" w:customStyle="1" w:styleId="af1">
+  <w:style w:type="paragraph" w:customStyle="1" w:styleId="user0">
+    <w:name w:val="頁首與頁尾 (user)"/>
+    <w:basedOn w:val="a1"/>
+    <w:qFormat/>
+    <w:pPr>
+      <w:suppressLineNumbers/>
+    </w:pPr>
+  </w:style>
+  <w:style w:type="paragraph" w:customStyle="1" w:styleId="af2">
     <w:name w:val="頁首與頁尾"/>
     <w:basedOn w:val="a1"/>
     <w:qFormat/>
-    <w:pPr>
-      <w:suppressLineNumbers/>
-    </w:pPr>
-  </w:style>
-  <w:style w:type="paragraph" w:customStyle="1" w:styleId="user1">
-    <w:name w:val="頁首與頁尾 (user)"/>
-    <w:basedOn w:val="a1"/>
-    <w:qFormat/>
-  </w:style>
-  <w:style w:type="paragraph" w:styleId="af2">
+  </w:style>
+  <w:style w:type="paragraph" w:styleId="af3">
     <w:name w:val="footer"/>
-    <w:basedOn w:val="af1"/>
+    <w:basedOn w:val="user0"/>
     <w:pPr>
       <w:jc w:val="center"/>
     </w:pPr>
   </w:style>
   <w:style w:type="paragraph" w:customStyle="1" w:styleId="100">
     <w:name w:val="書狀_證據編號10"/>
-    <w:basedOn w:val="af"/>
+    <w:basedOn w:val="af0"/>
     <w:qFormat/>
     <w:pPr>
       <w:ind w:left="1176" w:hanging="1176"/>
     </w:pPr>
   </w:style>
-  <w:style w:type="paragraph" w:customStyle="1" w:styleId="af3">
+  <w:style w:type="paragraph" w:customStyle="1" w:styleId="af4">
     <w:name w:val="書狀_被上證據編號"/>
-    <w:basedOn w:val="af"/>
+    <w:basedOn w:val="af0"/>
     <w:qFormat/>
     <w:pPr>
       <w:ind w:left="1323" w:hanging="1323"/>
@@ -2645,7 +2645,7 @@
   </w:style>
   <w:style w:type="paragraph" w:customStyle="1" w:styleId="101">
     <w:name w:val="書狀_被上證據編號10"/>
-    <w:basedOn w:val="af"/>
+    <w:basedOn w:val="af0"/>
     <w:qFormat/>
     <w:pPr>
       <w:ind w:left="1470" w:hanging="1470"/>
@@ -2653,7 +2653,7 @@
   </w:style>
   <w:style w:type="paragraph" w:customStyle="1" w:styleId="4">
     <w:name w:val="通用_層級4"/>
-    <w:basedOn w:val="a"/>
+    <w:basedOn w:val="a0"/>
     <w:qFormat/>
     <w:pPr>
       <w:numPr>
@@ -2662,9 +2662,9 @@
       <w:outlineLvl w:val="9"/>
     </w:pPr>
   </w:style>
-  <w:style w:type="paragraph" w:styleId="af4">
+  <w:style w:type="paragraph" w:styleId="af5">
     <w:name w:val="header"/>
-    <w:basedOn w:val="af1"/>
+    <w:basedOn w:val="user0"/>
     <w:pPr>
       <w:tabs>
         <w:tab w:val="center" w:pos="4536"/>
@@ -2672,9 +2672,9 @@
       </w:tabs>
     </w:pPr>
   </w:style>
-  <w:style w:type="paragraph" w:customStyle="1" w:styleId="af5">
+  <w:style w:type="paragraph" w:customStyle="1" w:styleId="af6">
     <w:name w:val="書狀_狀首當事人"/>
-    <w:basedOn w:val="ac"/>
+    <w:basedOn w:val="ad"/>
     <w:qFormat/>
     <w:rsid w:val="00B10778"/>
     <w:pPr>
@@ -2685,15 +2685,15 @@
       <w:jc w:val="left"/>
     </w:pPr>
   </w:style>
-  <w:style w:type="paragraph" w:styleId="af6">
+  <w:style w:type="paragraph" w:styleId="af7">
     <w:name w:val="Signature"/>
     <w:basedOn w:val="a1"/>
     <w:pPr>
       <w:suppressLineNumbers/>
     </w:pPr>
   </w:style>
-  <w:style w:type="paragraph" w:customStyle="1" w:styleId="user2">
-    <w:name w:val="已先格式設定文字 (user)"/>
+  <w:style w:type="paragraph" w:customStyle="1" w:styleId="af8">
+    <w:name w:val="已先格式設定文字"/>
     <w:basedOn w:val="a1"/>
     <w:qFormat/>
     <w:rPr>
@@ -2702,18 +2702,18 @@
       <w:szCs w:val="20"/>
     </w:rPr>
   </w:style>
-  <w:style w:type="paragraph" w:customStyle="1" w:styleId="af7">
+  <w:style w:type="paragraph" w:customStyle="1" w:styleId="af9">
     <w:name w:val="書狀_狀尾日期"/>
-    <w:basedOn w:val="ac"/>
-    <w:next w:val="ac"/>
+    <w:basedOn w:val="ad"/>
+    <w:next w:val="ad"/>
     <w:qFormat/>
     <w:rsid w:val="00E35EE7"/>
     <w:pPr>
       <w:jc w:val="distribute"/>
     </w:pPr>
   </w:style>
-  <w:style w:type="paragraph" w:customStyle="1" w:styleId="af8">
-    <w:name w:val="表格內容"/>
+  <w:style w:type="paragraph" w:customStyle="1" w:styleId="user1">
+    <w:name w:val="表格內容 (user)"/>
     <w:basedOn w:val="a1"/>
     <w:qFormat/>
     <w:pPr>
@@ -2721,9 +2721,9 @@
       <w:suppressLineNumbers/>
     </w:pPr>
   </w:style>
-  <w:style w:type="paragraph" w:customStyle="1" w:styleId="af9">
+  <w:style w:type="paragraph" w:customStyle="1" w:styleId="afa">
     <w:name w:val="爭點表_內容"/>
-    <w:basedOn w:val="ac"/>
+    <w:basedOn w:val="ad"/>
     <w:qFormat/>
     <w:pPr>
       <w:suppressLineNumbers/>
@@ -2734,9 +2734,9 @@
       <w:sz w:val="24"/>
     </w:rPr>
   </w:style>
-  <w:style w:type="paragraph" w:customStyle="1" w:styleId="afa">
+  <w:style w:type="paragraph" w:customStyle="1" w:styleId="afb">
     <w:name w:val="爭點表_清單"/>
-    <w:basedOn w:val="af9"/>
+    <w:basedOn w:val="afa"/>
     <w:qFormat/>
     <w:pPr>
       <w:tabs>
@@ -2745,9 +2745,9 @@
       <w:ind w:left="273" w:hanging="273"/>
     </w:pPr>
   </w:style>
-  <w:style w:type="paragraph" w:customStyle="1" w:styleId="afb">
+  <w:style w:type="paragraph" w:customStyle="1" w:styleId="afc">
     <w:name w:val="爭點表_標題"/>
-    <w:basedOn w:val="af9"/>
+    <w:basedOn w:val="afa"/>
     <w:qFormat/>
     <w:pPr>
       <w:spacing w:line="240" w:lineRule="auto"/>
@@ -2755,6 +2755,19 @@
     </w:pPr>
     <w:rPr>
       <w:bCs/>
+    </w:rPr>
+  </w:style>
+  <w:style w:type="paragraph" w:customStyle="1" w:styleId="afd">
+    <w:name w:val="書狀_區塊標題"/>
+    <w:basedOn w:val="ad"/>
+    <w:next w:val="1"/>
+    <w:qFormat/>
+    <w:pPr>
+      <w:overflowPunct w:val="0"/>
+      <w:ind w:left="1531"/>
+    </w:pPr>
+    <w:rPr>
+      <w:b/>
     </w:rPr>
   </w:style>
   <w:style w:type="numbering" w:customStyle="1" w:styleId="11">
@@ -2764,12 +2777,12 @@
     <w:unhideWhenUsed/>
     <w:qFormat/>
   </w:style>
-  <w:style w:type="numbering" w:customStyle="1" w:styleId="afc">
+  <w:style w:type="numbering" w:customStyle="1" w:styleId="afe">
     <w:name w:val="通用_多層次編號"/>
     <w:qFormat/>
   </w:style>
-  <w:style w:type="numbering" w:customStyle="1" w:styleId="user3">
-    <w:name w:val="項目符號 • (user)"/>
+  <w:style w:type="numbering" w:customStyle="1" w:styleId="aff">
+    <w:name w:val="項目符號 •"/>
     <w:qFormat/>
   </w:style>
 </w:styles>

</xml_diff>